<commit_message>
fix: some reading fixes
</commit_message>
<xml_diff>
--- a/Documentation/documentation-abnt.docx
+++ b/Documentation/documentation-abnt.docx
@@ -566,21 +566,7 @@
         <w:rPr>
           <w:rFonts w:ascii="Arial" w:eastAsia="Arial" w:hAnsi="Arial" w:cs="Arial"/>
         </w:rPr>
-        <w:t xml:space="preserve">Trabalho apresentado à disciplina de </w:t>
-      </w:r>
-      <w:proofErr w:type="spellStart"/>
-      <w:r>
-        <w:rPr>
-          <w:rFonts w:ascii="Arial" w:eastAsia="Arial" w:hAnsi="Arial" w:cs="Arial"/>
-        </w:rPr>
-        <w:t>Comiunicação</w:t>
-      </w:r>
-      <w:proofErr w:type="spellEnd"/>
-      <w:r>
-        <w:rPr>
-          <w:rFonts w:ascii="Arial" w:eastAsia="Arial" w:hAnsi="Arial" w:cs="Arial"/>
-        </w:rPr>
-        <w:t xml:space="preserve"> de Dados e Sistemas Reconfiguráveis do curso de Engenharia da Computação da Faculdade Engenheiro Salvador Arena como requisito parcial para obtenção de nota.</w:t>
+        <w:t>Trabalho apresentado à disciplina de Comunicação de Dados e Sistemas Reconfiguráveis do curso de Engenharia da Computação da Faculdade Engenheiro Salvador Arena como requisito parcial para obtenção de nota.</w:t>
       </w:r>
     </w:p>
     <w:p>
@@ -826,16 +812,12 @@
         <w:spacing w:line="360" w:lineRule="auto"/>
         <w:rPr>
           <w:rFonts w:ascii="Arial" w:eastAsia="Arial" w:hAnsi="Arial" w:cs="Arial"/>
-          <w:b/>
-          <w:bCs/>
-          <w:color w:val="000000"/>
-        </w:rPr>
-      </w:pPr>
-      <w:r>
-        <w:rPr>
-          <w:rFonts w:ascii="Arial" w:eastAsia="Arial" w:hAnsi="Arial" w:cs="Arial"/>
-          <w:b/>
-          <w:bCs/>
+          <w:color w:val="000000"/>
+        </w:rPr>
+      </w:pPr>
+      <w:r>
+        <w:rPr>
+          <w:rFonts w:ascii="Arial" w:eastAsia="Arial" w:hAnsi="Arial" w:cs="Arial"/>
           <w:color w:val="000000"/>
         </w:rPr>
         <w:t>Agradeço ao professor Vinícius S. Borges pelo incentivo, pela dedicação e pelos conhecimentos compartilhados ao longo do desenvolvimento deste trabalho.</w:t>
@@ -3711,7 +3693,21 @@
                 <w:rStyle w:val="Hyperlink"/>
                 <w:rFonts w:ascii="Arial" w:hAnsi="Arial" w:cs="Arial"/>
               </w:rPr>
-              <w:t>NRZ-L UNIPOLAR</w:t>
+              <w:t>NRZ-L U</w:t>
+            </w:r>
+            <w:r>
+              <w:rPr>
+                <w:rStyle w:val="Hyperlink"/>
+                <w:rFonts w:ascii="Arial" w:hAnsi="Arial" w:cs="Arial"/>
+              </w:rPr>
+              <w:t>N</w:t>
+            </w:r>
+            <w:r>
+              <w:rPr>
+                <w:rStyle w:val="Hyperlink"/>
+                <w:rFonts w:ascii="Arial" w:hAnsi="Arial" w:cs="Arial"/>
+              </w:rPr>
+              <w:t>IPOLAR</w:t>
             </w:r>
             <w:r>
               <w:rPr>
@@ -4966,12 +4962,22 @@
         <w:rPr>
           <w:rFonts w:ascii="Arial" w:eastAsia="Arial" w:hAnsi="Arial" w:cs="Arial"/>
         </w:rPr>
-        <w:t>Dentre as técnicas utilizadas para a transmissão de dados em sistemas digitais, destacam-se os métodos Unipolar Non-</w:t>
-      </w:r>
-      <w:proofErr w:type="spellStart"/>
-      <w:r>
-        <w:rPr>
-          <w:rFonts w:ascii="Arial" w:eastAsia="Arial" w:hAnsi="Arial" w:cs="Arial"/>
+        <w:t xml:space="preserve">Dentre as técnicas utilizadas para a transmissão de dados em sistemas digitais, destacam-se os métodos Unipolar </w:t>
+      </w:r>
+      <w:r>
+        <w:rPr>
+          <w:rFonts w:ascii="Arial" w:eastAsia="Arial" w:hAnsi="Arial" w:cs="Arial"/>
+          <w:i/>
+          <w:iCs/>
+        </w:rPr>
+        <w:t>Non-</w:t>
+      </w:r>
+      <w:proofErr w:type="spellStart"/>
+      <w:r>
+        <w:rPr>
+          <w:rFonts w:ascii="Arial" w:eastAsia="Arial" w:hAnsi="Arial" w:cs="Arial"/>
+          <w:i/>
+          <w:iCs/>
         </w:rPr>
         <w:t>Return</w:t>
       </w:r>
@@ -4979,6 +4985,8 @@
       <w:r>
         <w:rPr>
           <w:rFonts w:ascii="Arial" w:eastAsia="Arial" w:hAnsi="Arial" w:cs="Arial"/>
+          <w:i/>
+          <w:iCs/>
         </w:rPr>
         <w:t>-</w:t>
       </w:r>
@@ -4986,6 +4994,8 @@
       <w:r>
         <w:rPr>
           <w:rFonts w:ascii="Arial" w:eastAsia="Arial" w:hAnsi="Arial" w:cs="Arial"/>
+          <w:i/>
+          <w:iCs/>
         </w:rPr>
         <w:t>to</w:t>
       </w:r>
@@ -4993,6 +5003,8 @@
       <w:r>
         <w:rPr>
           <w:rFonts w:ascii="Arial" w:eastAsia="Arial" w:hAnsi="Arial" w:cs="Arial"/>
+          <w:i/>
+          <w:iCs/>
         </w:rPr>
         <w:t xml:space="preserve">-Zero </w:t>
       </w:r>
@@ -5000,6 +5012,8 @@
       <w:r>
         <w:rPr>
           <w:rFonts w:ascii="Arial" w:eastAsia="Arial" w:hAnsi="Arial" w:cs="Arial"/>
+          <w:i/>
+          <w:iCs/>
         </w:rPr>
         <w:t>Level</w:t>
       </w:r>
@@ -5635,12 +5649,22 @@
         <w:rPr>
           <w:rFonts w:ascii="Arial" w:eastAsia="Arial" w:hAnsi="Arial" w:cs="Arial"/>
         </w:rPr>
-        <w:t xml:space="preserve">As etapas a seguir descrevem os procedimentos para a obtenção ou criação do ambiente de projeto no software vivado design </w:t>
-      </w:r>
-      <w:proofErr w:type="spellStart"/>
-      <w:r>
-        <w:rPr>
-          <w:rFonts w:ascii="Arial" w:eastAsia="Arial" w:hAnsi="Arial" w:cs="Arial"/>
+        <w:t xml:space="preserve">As etapas a seguir descrevem os procedimentos para a obtenção ou criação do ambiente de projeto no </w:t>
+      </w:r>
+      <w:r>
+        <w:rPr>
+          <w:rFonts w:ascii="Arial" w:eastAsia="Arial" w:hAnsi="Arial" w:cs="Arial"/>
+          <w:i/>
+          <w:iCs/>
+        </w:rPr>
+        <w:t xml:space="preserve">software vivado design </w:t>
+      </w:r>
+      <w:proofErr w:type="spellStart"/>
+      <w:r>
+        <w:rPr>
+          <w:rFonts w:ascii="Arial" w:eastAsia="Arial" w:hAnsi="Arial" w:cs="Arial"/>
+          <w:i/>
+          <w:iCs/>
         </w:rPr>
         <w:t>suite</w:t>
       </w:r>
@@ -6633,6 +6657,14 @@
     </w:p>
     <w:p>
       <w:pPr>
+        <w:pStyle w:val="Estilo5"/>
+      </w:pPr>
+      <w:r>
+        <w:t>Antes de detalhar o conceito e a forma de representação do NRZ-L Unipolar, é importante compreender o contexto em que essa técnica se insere. Nos sistemas de comunicação digital, a codificação de linha é responsável por transformar os dados binários em sinais elétricos ou ópticos adequados para transmissão pelo meio físico. Entre os diversos esquemas existentes, o NRZ-L destaca-se por sua simplicidade e facilidade de implementação, sendo frequentemente utilizado como base para o entendimento de métodos mais complexos. No caso específico da codificação unipolar, os níveis de tensão adotados são definidos dentro de uma única polaridade, o que influencia diretamente características como consumo de energia, eficiência e robustez do sinal.</w:t>
+      </w:r>
+    </w:p>
+    <w:p>
+      <w:pPr>
         <w:pStyle w:val="Estilo2"/>
       </w:pPr>
       <w:bookmarkStart w:id="10" w:name="_Toc229135174"/>
@@ -6646,74 +6678,37 @@
     </w:p>
     <w:p>
       <w:pPr>
-        <w:pBdr>
-          <w:top w:val="nil"/>
-          <w:left w:val="nil"/>
-          <w:bottom w:val="nil"/>
-          <w:right w:val="nil"/>
-          <w:between w:val="nil"/>
-        </w:pBdr>
-        <w:ind w:firstLine="576"/>
-        <w:rPr>
-          <w:rFonts w:ascii="Arial" w:eastAsia="Arial" w:hAnsi="Arial" w:cs="Arial"/>
+        <w:pStyle w:val="Estilo5"/>
+        <w:rPr>
           <w:b/>
           <w:bCs/>
-          <w:color w:val="000000"/>
-        </w:rPr>
-      </w:pPr>
-      <w:r>
-        <w:rPr>
-          <w:rFonts w:ascii="Arial" w:eastAsia="Arial" w:hAnsi="Arial" w:cs="Arial"/>
-          <w:color w:val="000000"/>
-        </w:rPr>
+        </w:rPr>
+      </w:pPr>
+      <w:r>
         <w:t>O método de codificação de linha Non-</w:t>
       </w:r>
       <w:proofErr w:type="spellStart"/>
       <w:r>
-        <w:rPr>
-          <w:rFonts w:ascii="Arial" w:eastAsia="Arial" w:hAnsi="Arial" w:cs="Arial"/>
-          <w:color w:val="000000"/>
-        </w:rPr>
         <w:t>Return</w:t>
       </w:r>
       <w:proofErr w:type="spellEnd"/>
       <w:r>
-        <w:rPr>
-          <w:rFonts w:ascii="Arial" w:eastAsia="Arial" w:hAnsi="Arial" w:cs="Arial"/>
-          <w:color w:val="000000"/>
-        </w:rPr>
         <w:t>-</w:t>
       </w:r>
       <w:proofErr w:type="spellStart"/>
       <w:r>
-        <w:rPr>
-          <w:rFonts w:ascii="Arial" w:eastAsia="Arial" w:hAnsi="Arial" w:cs="Arial"/>
-          <w:color w:val="000000"/>
-        </w:rPr>
         <w:t>to</w:t>
       </w:r>
       <w:proofErr w:type="spellEnd"/>
       <w:r>
-        <w:rPr>
-          <w:rFonts w:ascii="Arial" w:eastAsia="Arial" w:hAnsi="Arial" w:cs="Arial"/>
-          <w:color w:val="000000"/>
-        </w:rPr>
         <w:t xml:space="preserve">-Zero </w:t>
       </w:r>
       <w:proofErr w:type="spellStart"/>
       <w:r>
-        <w:rPr>
-          <w:rFonts w:ascii="Arial" w:eastAsia="Arial" w:hAnsi="Arial" w:cs="Arial"/>
-          <w:color w:val="000000"/>
-        </w:rPr>
         <w:t>Level</w:t>
       </w:r>
       <w:proofErr w:type="spellEnd"/>
       <w:r>
-        <w:rPr>
-          <w:rFonts w:ascii="Arial" w:eastAsia="Arial" w:hAnsi="Arial" w:cs="Arial"/>
-          <w:color w:val="000000"/>
-        </w:rPr>
         <w:t xml:space="preserve"> (NRZ-L) é uma das técnicas mais fundamentais na comunicação de dados digitais, sendo caracterizado pela representação dos bits de dados por meio de níveis de tensão constantes durante todo o intervalo de transmissão, eliminando o retorno ao nível zero entre símbolos consecutivos. Essa característica simplifica o processo de codificação e aumenta a eficiência de banda, mas pode gerar problemas de sincronização em longas sequências de bits idênticos.</w:t>
       </w:r>
     </w:p>
@@ -6928,6 +6923,7 @@
           <w:sz w:val="20"/>
           <w:szCs w:val="20"/>
         </w:rPr>
+        <w:lastRenderedPageBreak/>
         <w:t>Legenda: Representação de uma modulação NRZ-L para a sequência 01011001, sendo 0 baixa e 1 alta.</w:t>
       </w:r>
     </w:p>
@@ -6959,6 +6955,34 @@
         <w:t>Implementação em VHDL</w:t>
       </w:r>
       <w:bookmarkEnd w:id="11"/>
+    </w:p>
+    <w:p>
+      <w:pPr>
+        <w:pStyle w:val="Estilo5"/>
+      </w:pPr>
+      <w:r>
+        <w:t xml:space="preserve">As etapas a seguir descrevem os procedimentos para </w:t>
+      </w:r>
+      <w:r>
+        <w:t xml:space="preserve">colocar o código de testes e de </w:t>
+      </w:r>
+      <w:r>
+        <w:rPr>
+          <w:i/>
+          <w:iCs/>
+        </w:rPr>
+        <w:t>design</w:t>
+      </w:r>
+      <w:r>
+        <w:rPr>
+          <w:i/>
+          <w:iCs/>
+        </w:rPr>
+        <w:t xml:space="preserve"> </w:t>
+      </w:r>
+      <w:r>
+        <w:t>dentro do aplicativo.</w:t>
+      </w:r>
     </w:p>
     <w:p>
       <w:pPr>
@@ -9842,6 +9866,7 @@
           <w:sz w:val="20"/>
           <w:szCs w:val="20"/>
         </w:rPr>
+        <w:lastRenderedPageBreak/>
         <w:t xml:space="preserve">                </w:t>
       </w:r>
       <w:proofErr w:type="spellStart"/>
@@ -10103,7 +10128,6 @@
           <w:sz w:val="20"/>
           <w:szCs w:val="20"/>
         </w:rPr>
-        <w:lastRenderedPageBreak/>
         <w:t xml:space="preserve">                    -- move </w:t>
       </w:r>
       <w:proofErr w:type="spellStart"/>
@@ -11316,6 +11340,7 @@
           <w:rFonts w:ascii="Arial" w:eastAsia="Arial" w:hAnsi="Arial" w:cs="Arial"/>
           <w:color w:val="000000"/>
         </w:rPr>
+        <w:lastRenderedPageBreak/>
         <w:t>Sinais de Controle Interno (</w:t>
       </w:r>
       <w:proofErr w:type="spellStart"/>
@@ -11355,7 +11380,6 @@
           <w:rFonts w:ascii="Arial" w:eastAsia="Arial" w:hAnsi="Arial" w:cs="Arial"/>
           <w:color w:val="000000"/>
         </w:rPr>
-        <w:lastRenderedPageBreak/>
         <w:t>Estes sinais operam dentro da arquitetura para gerir a execução do algoritmo:</w:t>
       </w:r>
     </w:p>
@@ -14101,6 +14125,7 @@
           <w:sz w:val="20"/>
           <w:szCs w:val="20"/>
         </w:rPr>
+        <w:lastRenderedPageBreak/>
         <w:t xml:space="preserve">    </w:t>
       </w:r>
       <w:proofErr w:type="spellStart"/>
@@ -14195,7 +14220,6 @@
           <w:sz w:val="20"/>
           <w:szCs w:val="20"/>
         </w:rPr>
-        <w:lastRenderedPageBreak/>
         <w:t xml:space="preserve">        -- </w:t>
       </w:r>
       <w:proofErr w:type="spellStart"/>
@@ -15241,7 +15265,7 @@
           <w:rFonts w:ascii="Arial" w:eastAsia="Arial" w:hAnsi="Arial" w:cs="Arial"/>
           <w:color w:val="000000"/>
         </w:rPr>
-        <w:t xml:space="preserve">Com base nos resultados obtidos, conclui-se que a implementação do módulo NRZ-L unipolar em VHDL foi bem-sucedida e cumpre integralmente os objetivos propostos. A simulação demonstrou que a estratégia de utilizar parâmetros configuráveis para a largura de dados e a duração dos bits confere ao projeto uma </w:t>
+        <w:t xml:space="preserve">Com base nos resultados obtidos, conclui-se que a implementação do módulo NRZ-L unipolar em VHDL foi bem-sucedida e cumpre integralmente os objetivos propostos. A simulação demonstrou que a estratégia de utilizar parâmetros </w:t>
       </w:r>
       <w:r>
         <w:rPr>
@@ -15249,7 +15273,7 @@
           <w:color w:val="000000"/>
         </w:rPr>
         <w:lastRenderedPageBreak/>
-        <w:t xml:space="preserve">flexibilidade essencial para diferentes aplicações em sistemas de comunicação digital. Embora a simplicidade do método NRZ-L facilite a implementação em hardware e otimize o uso da largura de banda, a observação das formas de onda reforça a característica intrínseca desta codificação de manter níveis constantes em sequências longas, o que exigiria mecanismos externos de sincronização em cenários reais. Em última análise, o circuito desenvolvido apresenta um comportamento robusto e estável, validando a lógica de controle por contadores e ponteiros para a correta serialização de dados em </w:t>
+        <w:t xml:space="preserve">configuráveis para a largura de dados e a duração dos bits confere ao projeto uma flexibilidade essencial para diferentes aplicações em sistemas de comunicação digital. Embora a simplicidade do método NRZ-L facilite a implementação em hardware e otimize o uso da largura de banda, a observação das formas de onda reforça a característica intrínseca desta codificação de manter níveis constantes em sequências longas, o que exigiria mecanismos externos de sincronização em cenários reais. Em última análise, o circuito desenvolvido apresenta um comportamento robusto e estável, validando a lógica de controle por contadores e ponteiros para a correta serialização de dados em </w:t>
       </w:r>
       <w:proofErr w:type="spellStart"/>
       <w:r>
@@ -15317,6 +15341,14 @@
         <w:t xml:space="preserve"> UNIPOLAR</w:t>
       </w:r>
       <w:bookmarkEnd w:id="17"/>
+    </w:p>
+    <w:p>
+      <w:pPr>
+        <w:pStyle w:val="Estilo5"/>
+      </w:pPr>
+      <w:r>
+        <w:t>Assim como o NRZ-L, o NRZ-I Unipolar é uma técnica de codificação de linha utilizada na transmissão de dados digitais, porém com uma abordagem diferente na representação dos bits. Em vez de associar diretamente níveis de tensão a valores lógicos, esse método baseia-se na ocorrência de transições no sinal. Essa característica permite melhorar certos aspectos da transmissão, especialmente em relação à detecção de mudanças no fluxo de dados.</w:t>
+      </w:r>
     </w:p>
     <w:p>
       <w:pPr>
@@ -15591,6 +15623,14 @@
     </w:p>
     <w:p>
       <w:pPr>
+        <w:pStyle w:val="Estilo5"/>
+      </w:pPr>
+      <w:r>
+        <w:t>A implementação do NRZ-I em VHDL consiste em descrever o comportamento do sinal com base nas transições de nível, utilizando lógica sequencial para armazenar o estado anterior e inverter o sinal sempre que necessário.</w:t>
+      </w:r>
+    </w:p>
+    <w:p>
+      <w:pPr>
         <w:pStyle w:val="Estilo3"/>
       </w:pPr>
       <w:bookmarkStart w:id="20" w:name="_Toc229135184"/>
@@ -17483,6 +17523,7 @@
           <w:sz w:val="20"/>
           <w:szCs w:val="20"/>
         </w:rPr>
+        <w:lastRenderedPageBreak/>
         <w:t>begin</w:t>
       </w:r>
       <w:proofErr w:type="spellEnd"/>
@@ -17632,1993 +17673,1993 @@
           <w:sz w:val="20"/>
           <w:szCs w:val="20"/>
         </w:rPr>
+        <w:t xml:space="preserve">            -- clean </w:t>
+      </w:r>
+      <w:proofErr w:type="spellStart"/>
+      <w:r>
+        <w:rPr>
+          <w:rFonts w:ascii="Courier New" w:eastAsia="Courier New" w:hAnsi="Courier New" w:cs="Courier New"/>
+          <w:sz w:val="20"/>
+          <w:szCs w:val="20"/>
+        </w:rPr>
+        <w:t>slate</w:t>
+      </w:r>
+      <w:proofErr w:type="spellEnd"/>
+      <w:r>
+        <w:rPr>
+          <w:rFonts w:ascii="Courier New" w:eastAsia="Courier New" w:hAnsi="Courier New" w:cs="Courier New"/>
+          <w:sz w:val="20"/>
+          <w:szCs w:val="20"/>
+        </w:rPr>
+        <w:t xml:space="preserve"> on reset</w:t>
+      </w:r>
+    </w:p>
+    <w:p>
+      <w:pPr>
+        <w:spacing w:after="120" w:line="240" w:lineRule="auto"/>
+        <w:rPr>
+          <w:rFonts w:ascii="Courier New" w:eastAsia="Courier New" w:hAnsi="Courier New" w:cs="Courier New"/>
+          <w:sz w:val="20"/>
+          <w:szCs w:val="20"/>
+        </w:rPr>
+      </w:pPr>
+      <w:r>
+        <w:rPr>
+          <w:rFonts w:ascii="Courier New" w:eastAsia="Courier New" w:hAnsi="Courier New" w:cs="Courier New"/>
+          <w:sz w:val="20"/>
+          <w:szCs w:val="20"/>
+        </w:rPr>
+        <w:t xml:space="preserve">            </w:t>
+      </w:r>
+      <w:proofErr w:type="spellStart"/>
+      <w:r>
+        <w:rPr>
+          <w:rFonts w:ascii="Courier New" w:eastAsia="Courier New" w:hAnsi="Courier New" w:cs="Courier New"/>
+          <w:sz w:val="20"/>
+          <w:szCs w:val="20"/>
+        </w:rPr>
+        <w:t>bit_ptr</w:t>
+      </w:r>
+      <w:proofErr w:type="spellEnd"/>
+      <w:r>
+        <w:rPr>
+          <w:rFonts w:ascii="Courier New" w:eastAsia="Courier New" w:hAnsi="Courier New" w:cs="Courier New"/>
+          <w:sz w:val="20"/>
+          <w:szCs w:val="20"/>
+        </w:rPr>
+        <w:t xml:space="preserve"> &lt;= DATA_WIDTH - 1;</w:t>
+      </w:r>
+    </w:p>
+    <w:p>
+      <w:pPr>
+        <w:spacing w:after="120" w:line="240" w:lineRule="auto"/>
+        <w:rPr>
+          <w:rFonts w:ascii="Courier New" w:eastAsia="Courier New" w:hAnsi="Courier New" w:cs="Courier New"/>
+          <w:sz w:val="20"/>
+          <w:szCs w:val="20"/>
+        </w:rPr>
+      </w:pPr>
+      <w:r>
+        <w:rPr>
+          <w:rFonts w:ascii="Courier New" w:eastAsia="Courier New" w:hAnsi="Courier New" w:cs="Courier New"/>
+          <w:sz w:val="20"/>
+          <w:szCs w:val="20"/>
+        </w:rPr>
+        <w:t xml:space="preserve">            </w:t>
+      </w:r>
+      <w:proofErr w:type="spellStart"/>
+      <w:r>
+        <w:rPr>
+          <w:rFonts w:ascii="Courier New" w:eastAsia="Courier New" w:hAnsi="Courier New" w:cs="Courier New"/>
+          <w:sz w:val="20"/>
+          <w:szCs w:val="20"/>
+        </w:rPr>
+        <w:t>tick_counter</w:t>
+      </w:r>
+      <w:proofErr w:type="spellEnd"/>
+      <w:r>
+        <w:rPr>
+          <w:rFonts w:ascii="Courier New" w:eastAsia="Courier New" w:hAnsi="Courier New" w:cs="Courier New"/>
+          <w:sz w:val="20"/>
+          <w:szCs w:val="20"/>
+        </w:rPr>
+        <w:t xml:space="preserve"> &lt;= 0;</w:t>
+      </w:r>
+    </w:p>
+    <w:p>
+      <w:pPr>
+        <w:spacing w:after="120" w:line="240" w:lineRule="auto"/>
+        <w:rPr>
+          <w:rFonts w:ascii="Courier New" w:eastAsia="Courier New" w:hAnsi="Courier New" w:cs="Courier New"/>
+          <w:sz w:val="20"/>
+          <w:szCs w:val="20"/>
+        </w:rPr>
+      </w:pPr>
+      <w:r>
+        <w:rPr>
+          <w:rFonts w:ascii="Courier New" w:eastAsia="Courier New" w:hAnsi="Courier New" w:cs="Courier New"/>
+          <w:sz w:val="20"/>
+          <w:szCs w:val="20"/>
+        </w:rPr>
+        <w:t xml:space="preserve">            </w:t>
+      </w:r>
+      <w:proofErr w:type="spellStart"/>
+      <w:r>
+        <w:rPr>
+          <w:rFonts w:ascii="Courier New" w:eastAsia="Courier New" w:hAnsi="Courier New" w:cs="Courier New"/>
+          <w:sz w:val="20"/>
+          <w:szCs w:val="20"/>
+        </w:rPr>
+        <w:t>current_lvl</w:t>
+      </w:r>
+      <w:proofErr w:type="spellEnd"/>
+      <w:r>
+        <w:rPr>
+          <w:rFonts w:ascii="Courier New" w:eastAsia="Courier New" w:hAnsi="Courier New" w:cs="Courier New"/>
+          <w:sz w:val="20"/>
+          <w:szCs w:val="20"/>
+        </w:rPr>
+        <w:t xml:space="preserve"> &lt;= '0';</w:t>
+      </w:r>
+    </w:p>
+    <w:p>
+      <w:pPr>
+        <w:spacing w:after="120" w:line="240" w:lineRule="auto"/>
+        <w:rPr>
+          <w:rFonts w:ascii="Courier New" w:eastAsia="Courier New" w:hAnsi="Courier New" w:cs="Courier New"/>
+          <w:sz w:val="20"/>
+          <w:szCs w:val="20"/>
+        </w:rPr>
+      </w:pPr>
+      <w:r>
+        <w:rPr>
+          <w:rFonts w:ascii="Courier New" w:eastAsia="Courier New" w:hAnsi="Courier New" w:cs="Courier New"/>
+          <w:sz w:val="20"/>
+          <w:szCs w:val="20"/>
+        </w:rPr>
+        <w:t xml:space="preserve">            </w:t>
+      </w:r>
+      <w:proofErr w:type="spellStart"/>
+      <w:r>
+        <w:rPr>
+          <w:rFonts w:ascii="Courier New" w:eastAsia="Courier New" w:hAnsi="Courier New" w:cs="Courier New"/>
+          <w:sz w:val="20"/>
+          <w:szCs w:val="20"/>
+        </w:rPr>
+        <w:t>nrz_out</w:t>
+      </w:r>
+      <w:proofErr w:type="spellEnd"/>
+      <w:r>
+        <w:rPr>
+          <w:rFonts w:ascii="Courier New" w:eastAsia="Courier New" w:hAnsi="Courier New" w:cs="Courier New"/>
+          <w:sz w:val="20"/>
+          <w:szCs w:val="20"/>
+        </w:rPr>
+        <w:t xml:space="preserve"> &lt;= '0';</w:t>
+      </w:r>
+    </w:p>
+    <w:p>
+      <w:pPr>
+        <w:spacing w:after="120" w:line="240" w:lineRule="auto"/>
+        <w:rPr>
+          <w:rFonts w:ascii="Courier New" w:eastAsia="Courier New" w:hAnsi="Courier New" w:cs="Courier New"/>
+          <w:sz w:val="20"/>
+          <w:szCs w:val="20"/>
+        </w:rPr>
+      </w:pPr>
+      <w:r>
+        <w:rPr>
+          <w:rFonts w:ascii="Courier New" w:eastAsia="Courier New" w:hAnsi="Courier New" w:cs="Courier New"/>
+          <w:sz w:val="20"/>
+          <w:szCs w:val="20"/>
+        </w:rPr>
+        <w:t xml:space="preserve">        </w:t>
+      </w:r>
+      <w:proofErr w:type="spellStart"/>
+      <w:r>
+        <w:rPr>
+          <w:rFonts w:ascii="Courier New" w:eastAsia="Courier New" w:hAnsi="Courier New" w:cs="Courier New"/>
+          <w:sz w:val="20"/>
+          <w:szCs w:val="20"/>
+        </w:rPr>
+        <w:t>elsif</w:t>
+      </w:r>
+      <w:proofErr w:type="spellEnd"/>
+      <w:r>
+        <w:rPr>
+          <w:rFonts w:ascii="Courier New" w:eastAsia="Courier New" w:hAnsi="Courier New" w:cs="Courier New"/>
+          <w:sz w:val="20"/>
+          <w:szCs w:val="20"/>
+        </w:rPr>
+        <w:t xml:space="preserve"> rising_edge(clk) </w:t>
+      </w:r>
+      <w:proofErr w:type="spellStart"/>
+      <w:r>
+        <w:rPr>
+          <w:rFonts w:ascii="Courier New" w:eastAsia="Courier New" w:hAnsi="Courier New" w:cs="Courier New"/>
+          <w:sz w:val="20"/>
+          <w:szCs w:val="20"/>
+        </w:rPr>
+        <w:t>then</w:t>
+      </w:r>
+      <w:proofErr w:type="spellEnd"/>
+    </w:p>
+    <w:p>
+      <w:pPr>
+        <w:spacing w:after="120" w:line="240" w:lineRule="auto"/>
+        <w:rPr>
+          <w:rFonts w:ascii="Courier New" w:eastAsia="Courier New" w:hAnsi="Courier New" w:cs="Courier New"/>
+          <w:sz w:val="20"/>
+          <w:szCs w:val="20"/>
+        </w:rPr>
+      </w:pPr>
+      <w:r>
+        <w:rPr>
+          <w:rFonts w:ascii="Courier New" w:eastAsia="Courier New" w:hAnsi="Courier New" w:cs="Courier New"/>
+          <w:sz w:val="20"/>
+          <w:szCs w:val="20"/>
+        </w:rPr>
+        <w:t xml:space="preserve">            </w:t>
+      </w:r>
+    </w:p>
+    <w:p>
+      <w:pPr>
+        <w:spacing w:after="120" w:line="240" w:lineRule="auto"/>
+        <w:rPr>
+          <w:rFonts w:ascii="Courier New" w:eastAsia="Courier New" w:hAnsi="Courier New" w:cs="Courier New"/>
+          <w:sz w:val="20"/>
+          <w:szCs w:val="20"/>
+        </w:rPr>
+      </w:pPr>
+      <w:r>
+        <w:rPr>
+          <w:rFonts w:ascii="Courier New" w:eastAsia="Courier New" w:hAnsi="Courier New" w:cs="Courier New"/>
+          <w:sz w:val="20"/>
+          <w:szCs w:val="20"/>
+        </w:rPr>
+        <w:t xml:space="preserve">            -- </w:t>
+      </w:r>
+      <w:proofErr w:type="spellStart"/>
+      <w:r>
+        <w:rPr>
+          <w:rFonts w:ascii="Courier New" w:eastAsia="Courier New" w:hAnsi="Courier New" w:cs="Courier New"/>
+          <w:sz w:val="20"/>
+          <w:szCs w:val="20"/>
+        </w:rPr>
+        <w:t>nrzi</w:t>
+      </w:r>
+      <w:proofErr w:type="spellEnd"/>
+      <w:r>
+        <w:rPr>
+          <w:rFonts w:ascii="Courier New" w:eastAsia="Courier New" w:hAnsi="Courier New" w:cs="Courier New"/>
+          <w:sz w:val="20"/>
+          <w:szCs w:val="20"/>
+        </w:rPr>
+        <w:t xml:space="preserve"> </w:t>
+      </w:r>
+      <w:proofErr w:type="spellStart"/>
+      <w:r>
+        <w:rPr>
+          <w:rFonts w:ascii="Courier New" w:eastAsia="Courier New" w:hAnsi="Courier New" w:cs="Courier New"/>
+          <w:sz w:val="20"/>
+          <w:szCs w:val="20"/>
+        </w:rPr>
+        <w:t>logic</w:t>
+      </w:r>
+      <w:proofErr w:type="spellEnd"/>
+      <w:r>
+        <w:rPr>
+          <w:rFonts w:ascii="Courier New" w:eastAsia="Courier New" w:hAnsi="Courier New" w:cs="Courier New"/>
+          <w:sz w:val="20"/>
+          <w:szCs w:val="20"/>
+        </w:rPr>
+        <w:t xml:space="preserve">: </w:t>
+      </w:r>
+      <w:proofErr w:type="spellStart"/>
+      <w:r>
+        <w:rPr>
+          <w:rFonts w:ascii="Courier New" w:eastAsia="Courier New" w:hAnsi="Courier New" w:cs="Courier New"/>
+          <w:sz w:val="20"/>
+          <w:szCs w:val="20"/>
+        </w:rPr>
+        <w:t>evaluate</w:t>
+      </w:r>
+      <w:proofErr w:type="spellEnd"/>
+      <w:r>
+        <w:rPr>
+          <w:rFonts w:ascii="Courier New" w:eastAsia="Courier New" w:hAnsi="Courier New" w:cs="Courier New"/>
+          <w:sz w:val="20"/>
+          <w:szCs w:val="20"/>
+        </w:rPr>
+        <w:t xml:space="preserve"> </w:t>
+      </w:r>
+      <w:proofErr w:type="spellStart"/>
+      <w:r>
+        <w:rPr>
+          <w:rFonts w:ascii="Courier New" w:eastAsia="Courier New" w:hAnsi="Courier New" w:cs="Courier New"/>
+          <w:sz w:val="20"/>
+          <w:szCs w:val="20"/>
+        </w:rPr>
+        <w:t>only</w:t>
+      </w:r>
+      <w:proofErr w:type="spellEnd"/>
+      <w:r>
+        <w:rPr>
+          <w:rFonts w:ascii="Courier New" w:eastAsia="Courier New" w:hAnsi="Courier New" w:cs="Courier New"/>
+          <w:sz w:val="20"/>
+          <w:szCs w:val="20"/>
+        </w:rPr>
+        <w:t xml:space="preserve"> </w:t>
+      </w:r>
+      <w:proofErr w:type="spellStart"/>
+      <w:r>
+        <w:rPr>
+          <w:rFonts w:ascii="Courier New" w:eastAsia="Courier New" w:hAnsi="Courier New" w:cs="Courier New"/>
+          <w:sz w:val="20"/>
+          <w:szCs w:val="20"/>
+        </w:rPr>
+        <w:t>at</w:t>
+      </w:r>
+      <w:proofErr w:type="spellEnd"/>
+      <w:r>
+        <w:rPr>
+          <w:rFonts w:ascii="Courier New" w:eastAsia="Courier New" w:hAnsi="Courier New" w:cs="Courier New"/>
+          <w:sz w:val="20"/>
+          <w:szCs w:val="20"/>
+        </w:rPr>
+        <w:t xml:space="preserve"> </w:t>
+      </w:r>
+      <w:proofErr w:type="spellStart"/>
+      <w:r>
+        <w:rPr>
+          <w:rFonts w:ascii="Courier New" w:eastAsia="Courier New" w:hAnsi="Courier New" w:cs="Courier New"/>
+          <w:sz w:val="20"/>
+          <w:szCs w:val="20"/>
+        </w:rPr>
+        <w:t>the</w:t>
+      </w:r>
+      <w:proofErr w:type="spellEnd"/>
+      <w:r>
+        <w:rPr>
+          <w:rFonts w:ascii="Courier New" w:eastAsia="Courier New" w:hAnsi="Courier New" w:cs="Courier New"/>
+          <w:sz w:val="20"/>
+          <w:szCs w:val="20"/>
+        </w:rPr>
+        <w:t xml:space="preserve"> start </w:t>
+      </w:r>
+      <w:proofErr w:type="spellStart"/>
+      <w:r>
+        <w:rPr>
+          <w:rFonts w:ascii="Courier New" w:eastAsia="Courier New" w:hAnsi="Courier New" w:cs="Courier New"/>
+          <w:sz w:val="20"/>
+          <w:szCs w:val="20"/>
+        </w:rPr>
+        <w:t>of</w:t>
+      </w:r>
+      <w:proofErr w:type="spellEnd"/>
+      <w:r>
+        <w:rPr>
+          <w:rFonts w:ascii="Courier New" w:eastAsia="Courier New" w:hAnsi="Courier New" w:cs="Courier New"/>
+          <w:sz w:val="20"/>
+          <w:szCs w:val="20"/>
+        </w:rPr>
+        <w:t xml:space="preserve"> a new bit </w:t>
+      </w:r>
+      <w:proofErr w:type="spellStart"/>
+      <w:r>
+        <w:rPr>
+          <w:rFonts w:ascii="Courier New" w:eastAsia="Courier New" w:hAnsi="Courier New" w:cs="Courier New"/>
+          <w:sz w:val="20"/>
+          <w:szCs w:val="20"/>
+        </w:rPr>
+        <w:t>cycle</w:t>
+      </w:r>
+      <w:proofErr w:type="spellEnd"/>
+    </w:p>
+    <w:p>
+      <w:pPr>
+        <w:spacing w:after="120" w:line="240" w:lineRule="auto"/>
+        <w:rPr>
+          <w:rFonts w:ascii="Courier New" w:eastAsia="Courier New" w:hAnsi="Courier New" w:cs="Courier New"/>
+          <w:sz w:val="20"/>
+          <w:szCs w:val="20"/>
+        </w:rPr>
+      </w:pPr>
+      <w:r>
+        <w:rPr>
+          <w:rFonts w:ascii="Courier New" w:eastAsia="Courier New" w:hAnsi="Courier New" w:cs="Courier New"/>
+          <w:sz w:val="20"/>
+          <w:szCs w:val="20"/>
+        </w:rPr>
+        <w:t xml:space="preserve">            </w:t>
+      </w:r>
+      <w:proofErr w:type="spellStart"/>
+      <w:r>
+        <w:rPr>
+          <w:rFonts w:ascii="Courier New" w:eastAsia="Courier New" w:hAnsi="Courier New" w:cs="Courier New"/>
+          <w:sz w:val="20"/>
+          <w:szCs w:val="20"/>
+        </w:rPr>
+        <w:t>if</w:t>
+      </w:r>
+      <w:proofErr w:type="spellEnd"/>
+      <w:r>
+        <w:rPr>
+          <w:rFonts w:ascii="Courier New" w:eastAsia="Courier New" w:hAnsi="Courier New" w:cs="Courier New"/>
+          <w:sz w:val="20"/>
+          <w:szCs w:val="20"/>
+        </w:rPr>
+        <w:t xml:space="preserve"> </w:t>
+      </w:r>
+      <w:proofErr w:type="spellStart"/>
+      <w:r>
+        <w:rPr>
+          <w:rFonts w:ascii="Courier New" w:eastAsia="Courier New" w:hAnsi="Courier New" w:cs="Courier New"/>
+          <w:sz w:val="20"/>
+          <w:szCs w:val="20"/>
+        </w:rPr>
+        <w:t>tick_counter</w:t>
+      </w:r>
+      <w:proofErr w:type="spellEnd"/>
+      <w:r>
+        <w:rPr>
+          <w:rFonts w:ascii="Courier New" w:eastAsia="Courier New" w:hAnsi="Courier New" w:cs="Courier New"/>
+          <w:sz w:val="20"/>
+          <w:szCs w:val="20"/>
+        </w:rPr>
+        <w:t xml:space="preserve"> = 0 </w:t>
+      </w:r>
+      <w:proofErr w:type="spellStart"/>
+      <w:r>
+        <w:rPr>
+          <w:rFonts w:ascii="Courier New" w:eastAsia="Courier New" w:hAnsi="Courier New" w:cs="Courier New"/>
+          <w:sz w:val="20"/>
+          <w:szCs w:val="20"/>
+        </w:rPr>
+        <w:t>then</w:t>
+      </w:r>
+      <w:proofErr w:type="spellEnd"/>
+    </w:p>
+    <w:p>
+      <w:pPr>
+        <w:spacing w:after="120" w:line="240" w:lineRule="auto"/>
+        <w:rPr>
+          <w:rFonts w:ascii="Courier New" w:eastAsia="Courier New" w:hAnsi="Courier New" w:cs="Courier New"/>
+          <w:sz w:val="20"/>
+          <w:szCs w:val="20"/>
+        </w:rPr>
+      </w:pPr>
+      <w:r>
+        <w:rPr>
+          <w:rFonts w:ascii="Courier New" w:eastAsia="Courier New" w:hAnsi="Courier New" w:cs="Courier New"/>
+          <w:sz w:val="20"/>
+          <w:szCs w:val="20"/>
+        </w:rPr>
+        <w:t xml:space="preserve">                </w:t>
+      </w:r>
+      <w:proofErr w:type="spellStart"/>
+      <w:r>
+        <w:rPr>
+          <w:rFonts w:ascii="Courier New" w:eastAsia="Courier New" w:hAnsi="Courier New" w:cs="Courier New"/>
+          <w:sz w:val="20"/>
+          <w:szCs w:val="20"/>
+        </w:rPr>
+        <w:t>if</w:t>
+      </w:r>
+      <w:proofErr w:type="spellEnd"/>
+      <w:r>
+        <w:rPr>
+          <w:rFonts w:ascii="Courier New" w:eastAsia="Courier New" w:hAnsi="Courier New" w:cs="Courier New"/>
+          <w:sz w:val="20"/>
+          <w:szCs w:val="20"/>
+        </w:rPr>
+        <w:t xml:space="preserve"> </w:t>
+      </w:r>
+      <w:proofErr w:type="spellStart"/>
+      <w:r>
+        <w:rPr>
+          <w:rFonts w:ascii="Courier New" w:eastAsia="Courier New" w:hAnsi="Courier New" w:cs="Courier New"/>
+          <w:sz w:val="20"/>
+          <w:szCs w:val="20"/>
+        </w:rPr>
+        <w:t>data_in</w:t>
+      </w:r>
+      <w:proofErr w:type="spellEnd"/>
+      <w:r>
+        <w:rPr>
+          <w:rFonts w:ascii="Courier New" w:eastAsia="Courier New" w:hAnsi="Courier New" w:cs="Courier New"/>
+          <w:sz w:val="20"/>
+          <w:szCs w:val="20"/>
+        </w:rPr>
+        <w:t>(</w:t>
+      </w:r>
+      <w:proofErr w:type="spellStart"/>
+      <w:r>
+        <w:rPr>
+          <w:rFonts w:ascii="Courier New" w:eastAsia="Courier New" w:hAnsi="Courier New" w:cs="Courier New"/>
+          <w:sz w:val="20"/>
+          <w:szCs w:val="20"/>
+        </w:rPr>
+        <w:t>bit_ptr</w:t>
+      </w:r>
+      <w:proofErr w:type="spellEnd"/>
+      <w:r>
+        <w:rPr>
+          <w:rFonts w:ascii="Courier New" w:eastAsia="Courier New" w:hAnsi="Courier New" w:cs="Courier New"/>
+          <w:sz w:val="20"/>
+          <w:szCs w:val="20"/>
+        </w:rPr>
+        <w:t xml:space="preserve">) = '1' </w:t>
+      </w:r>
+      <w:proofErr w:type="spellStart"/>
+      <w:r>
+        <w:rPr>
+          <w:rFonts w:ascii="Courier New" w:eastAsia="Courier New" w:hAnsi="Courier New" w:cs="Courier New"/>
+          <w:sz w:val="20"/>
+          <w:szCs w:val="20"/>
+        </w:rPr>
+        <w:t>then</w:t>
+      </w:r>
+      <w:proofErr w:type="spellEnd"/>
+    </w:p>
+    <w:p>
+      <w:pPr>
+        <w:spacing w:after="120" w:line="240" w:lineRule="auto"/>
+        <w:rPr>
+          <w:rFonts w:ascii="Courier New" w:eastAsia="Courier New" w:hAnsi="Courier New" w:cs="Courier New"/>
+          <w:sz w:val="20"/>
+          <w:szCs w:val="20"/>
+        </w:rPr>
+      </w:pPr>
+      <w:r>
+        <w:rPr>
+          <w:rFonts w:ascii="Courier New" w:eastAsia="Courier New" w:hAnsi="Courier New" w:cs="Courier New"/>
+          <w:sz w:val="20"/>
+          <w:szCs w:val="20"/>
+        </w:rPr>
+        <w:t xml:space="preserve">                    -- 1 </w:t>
+      </w:r>
+      <w:proofErr w:type="spellStart"/>
+      <w:r>
+        <w:rPr>
+          <w:rFonts w:ascii="Courier New" w:eastAsia="Courier New" w:hAnsi="Courier New" w:cs="Courier New"/>
+          <w:sz w:val="20"/>
+          <w:szCs w:val="20"/>
+        </w:rPr>
+        <w:t>means</w:t>
+      </w:r>
+      <w:proofErr w:type="spellEnd"/>
+      <w:r>
+        <w:rPr>
+          <w:rFonts w:ascii="Courier New" w:eastAsia="Courier New" w:hAnsi="Courier New" w:cs="Courier New"/>
+          <w:sz w:val="20"/>
+          <w:szCs w:val="20"/>
+        </w:rPr>
+        <w:t xml:space="preserve"> toggle the line</w:t>
+      </w:r>
+    </w:p>
+    <w:p>
+      <w:pPr>
+        <w:spacing w:after="120" w:line="240" w:lineRule="auto"/>
+        <w:rPr>
+          <w:rFonts w:ascii="Courier New" w:eastAsia="Courier New" w:hAnsi="Courier New" w:cs="Courier New"/>
+          <w:sz w:val="20"/>
+          <w:szCs w:val="20"/>
+        </w:rPr>
+      </w:pPr>
+      <w:r>
+        <w:rPr>
+          <w:rFonts w:ascii="Courier New" w:eastAsia="Courier New" w:hAnsi="Courier New" w:cs="Courier New"/>
+          <w:sz w:val="20"/>
+          <w:szCs w:val="20"/>
+        </w:rPr>
+        <w:t xml:space="preserve">                    </w:t>
+      </w:r>
+      <w:proofErr w:type="spellStart"/>
+      <w:r>
+        <w:rPr>
+          <w:rFonts w:ascii="Courier New" w:eastAsia="Courier New" w:hAnsi="Courier New" w:cs="Courier New"/>
+          <w:sz w:val="20"/>
+          <w:szCs w:val="20"/>
+        </w:rPr>
+        <w:t>current_lvl</w:t>
+      </w:r>
+      <w:proofErr w:type="spellEnd"/>
+      <w:r>
+        <w:rPr>
+          <w:rFonts w:ascii="Courier New" w:eastAsia="Courier New" w:hAnsi="Courier New" w:cs="Courier New"/>
+          <w:sz w:val="20"/>
+          <w:szCs w:val="20"/>
+        </w:rPr>
+        <w:t xml:space="preserve"> &lt;= not </w:t>
+      </w:r>
+      <w:proofErr w:type="spellStart"/>
+      <w:r>
+        <w:rPr>
+          <w:rFonts w:ascii="Courier New" w:eastAsia="Courier New" w:hAnsi="Courier New" w:cs="Courier New"/>
+          <w:sz w:val="20"/>
+          <w:szCs w:val="20"/>
+        </w:rPr>
+        <w:t>current_lvl</w:t>
+      </w:r>
+      <w:proofErr w:type="spellEnd"/>
+      <w:r>
+        <w:rPr>
+          <w:rFonts w:ascii="Courier New" w:eastAsia="Courier New" w:hAnsi="Courier New" w:cs="Courier New"/>
+          <w:sz w:val="20"/>
+          <w:szCs w:val="20"/>
+        </w:rPr>
+        <w:t>;</w:t>
+      </w:r>
+    </w:p>
+    <w:p>
+      <w:pPr>
+        <w:spacing w:after="120" w:line="240" w:lineRule="auto"/>
+        <w:rPr>
+          <w:rFonts w:ascii="Courier New" w:eastAsia="Courier New" w:hAnsi="Courier New" w:cs="Courier New"/>
+          <w:sz w:val="20"/>
+          <w:szCs w:val="20"/>
+        </w:rPr>
+      </w:pPr>
+      <w:r>
+        <w:rPr>
+          <w:rFonts w:ascii="Courier New" w:eastAsia="Courier New" w:hAnsi="Courier New" w:cs="Courier New"/>
+          <w:sz w:val="20"/>
+          <w:szCs w:val="20"/>
+        </w:rPr>
+        <w:t xml:space="preserve">                    </w:t>
+      </w:r>
+      <w:proofErr w:type="spellStart"/>
+      <w:r>
+        <w:rPr>
+          <w:rFonts w:ascii="Courier New" w:eastAsia="Courier New" w:hAnsi="Courier New" w:cs="Courier New"/>
+          <w:sz w:val="20"/>
+          <w:szCs w:val="20"/>
+        </w:rPr>
+        <w:t>nrz_out</w:t>
+      </w:r>
+      <w:proofErr w:type="spellEnd"/>
+      <w:r>
+        <w:rPr>
+          <w:rFonts w:ascii="Courier New" w:eastAsia="Courier New" w:hAnsi="Courier New" w:cs="Courier New"/>
+          <w:sz w:val="20"/>
+          <w:szCs w:val="20"/>
+        </w:rPr>
+        <w:t xml:space="preserve"> &lt;= </w:t>
+      </w:r>
+      <w:proofErr w:type="spellStart"/>
+      <w:r>
+        <w:rPr>
+          <w:rFonts w:ascii="Courier New" w:eastAsia="Courier New" w:hAnsi="Courier New" w:cs="Courier New"/>
+          <w:sz w:val="20"/>
+          <w:szCs w:val="20"/>
+        </w:rPr>
+        <w:t>not</w:t>
+      </w:r>
+      <w:proofErr w:type="spellEnd"/>
+      <w:r>
+        <w:rPr>
+          <w:rFonts w:ascii="Courier New" w:eastAsia="Courier New" w:hAnsi="Courier New" w:cs="Courier New"/>
+          <w:sz w:val="20"/>
+          <w:szCs w:val="20"/>
+        </w:rPr>
+        <w:t xml:space="preserve"> </w:t>
+      </w:r>
+      <w:proofErr w:type="spellStart"/>
+      <w:r>
+        <w:rPr>
+          <w:rFonts w:ascii="Courier New" w:eastAsia="Courier New" w:hAnsi="Courier New" w:cs="Courier New"/>
+          <w:sz w:val="20"/>
+          <w:szCs w:val="20"/>
+        </w:rPr>
+        <w:t>current_lvl</w:t>
+      </w:r>
+      <w:proofErr w:type="spellEnd"/>
+      <w:r>
+        <w:rPr>
+          <w:rFonts w:ascii="Courier New" w:eastAsia="Courier New" w:hAnsi="Courier New" w:cs="Courier New"/>
+          <w:sz w:val="20"/>
+          <w:szCs w:val="20"/>
+        </w:rPr>
+        <w:t xml:space="preserve">; -- </w:t>
+      </w:r>
+      <w:proofErr w:type="spellStart"/>
+      <w:r>
+        <w:rPr>
+          <w:rFonts w:ascii="Courier New" w:eastAsia="Courier New" w:hAnsi="Courier New" w:cs="Courier New"/>
+          <w:sz w:val="20"/>
+          <w:szCs w:val="20"/>
+        </w:rPr>
+        <w:t>instantly</w:t>
+      </w:r>
+      <w:proofErr w:type="spellEnd"/>
+      <w:r>
+        <w:rPr>
+          <w:rFonts w:ascii="Courier New" w:eastAsia="Courier New" w:hAnsi="Courier New" w:cs="Courier New"/>
+          <w:sz w:val="20"/>
+          <w:szCs w:val="20"/>
+        </w:rPr>
+        <w:t xml:space="preserve"> push to output</w:t>
+      </w:r>
+    </w:p>
+    <w:p>
+      <w:pPr>
+        <w:spacing w:after="120" w:line="240" w:lineRule="auto"/>
+        <w:rPr>
+          <w:rFonts w:ascii="Courier New" w:eastAsia="Courier New" w:hAnsi="Courier New" w:cs="Courier New"/>
+          <w:sz w:val="20"/>
+          <w:szCs w:val="20"/>
+        </w:rPr>
+      </w:pPr>
+      <w:r>
+        <w:rPr>
+          <w:rFonts w:ascii="Courier New" w:eastAsia="Courier New" w:hAnsi="Courier New" w:cs="Courier New"/>
+          <w:sz w:val="20"/>
+          <w:szCs w:val="20"/>
+        </w:rPr>
+        <w:t xml:space="preserve">                </w:t>
+      </w:r>
+      <w:proofErr w:type="spellStart"/>
+      <w:r>
+        <w:rPr>
+          <w:rFonts w:ascii="Courier New" w:eastAsia="Courier New" w:hAnsi="Courier New" w:cs="Courier New"/>
+          <w:sz w:val="20"/>
+          <w:szCs w:val="20"/>
+        </w:rPr>
+        <w:t>else</w:t>
+      </w:r>
+      <w:proofErr w:type="spellEnd"/>
+    </w:p>
+    <w:p>
+      <w:pPr>
+        <w:spacing w:after="120" w:line="240" w:lineRule="auto"/>
+        <w:rPr>
+          <w:rFonts w:ascii="Courier New" w:eastAsia="Courier New" w:hAnsi="Courier New" w:cs="Courier New"/>
+          <w:sz w:val="20"/>
+          <w:szCs w:val="20"/>
+        </w:rPr>
+      </w:pPr>
+      <w:r>
+        <w:rPr>
+          <w:rFonts w:ascii="Courier New" w:eastAsia="Courier New" w:hAnsi="Courier New" w:cs="Courier New"/>
+          <w:sz w:val="20"/>
+          <w:szCs w:val="20"/>
+        </w:rPr>
+        <w:t xml:space="preserve">                    -- 0 </w:t>
+      </w:r>
+      <w:proofErr w:type="spellStart"/>
+      <w:r>
+        <w:rPr>
+          <w:rFonts w:ascii="Courier New" w:eastAsia="Courier New" w:hAnsi="Courier New" w:cs="Courier New"/>
+          <w:sz w:val="20"/>
+          <w:szCs w:val="20"/>
+        </w:rPr>
+        <w:t>means</w:t>
+      </w:r>
+      <w:proofErr w:type="spellEnd"/>
+      <w:r>
+        <w:rPr>
+          <w:rFonts w:ascii="Courier New" w:eastAsia="Courier New" w:hAnsi="Courier New" w:cs="Courier New"/>
+          <w:sz w:val="20"/>
+          <w:szCs w:val="20"/>
+        </w:rPr>
+        <w:t xml:space="preserve"> </w:t>
+      </w:r>
+      <w:proofErr w:type="spellStart"/>
+      <w:r>
+        <w:rPr>
+          <w:rFonts w:ascii="Courier New" w:eastAsia="Courier New" w:hAnsi="Courier New" w:cs="Courier New"/>
+          <w:sz w:val="20"/>
+          <w:szCs w:val="20"/>
+        </w:rPr>
+        <w:t>hold</w:t>
+      </w:r>
+      <w:proofErr w:type="spellEnd"/>
+      <w:r>
+        <w:rPr>
+          <w:rFonts w:ascii="Courier New" w:eastAsia="Courier New" w:hAnsi="Courier New" w:cs="Courier New"/>
+          <w:sz w:val="20"/>
+          <w:szCs w:val="20"/>
+        </w:rPr>
+        <w:t xml:space="preserve"> </w:t>
+      </w:r>
+      <w:proofErr w:type="spellStart"/>
+      <w:r>
+        <w:rPr>
+          <w:rFonts w:ascii="Courier New" w:eastAsia="Courier New" w:hAnsi="Courier New" w:cs="Courier New"/>
+          <w:sz w:val="20"/>
+          <w:szCs w:val="20"/>
+        </w:rPr>
+        <w:t>the</w:t>
+      </w:r>
+      <w:proofErr w:type="spellEnd"/>
+      <w:r>
+        <w:rPr>
+          <w:rFonts w:ascii="Courier New" w:eastAsia="Courier New" w:hAnsi="Courier New" w:cs="Courier New"/>
+          <w:sz w:val="20"/>
+          <w:szCs w:val="20"/>
+        </w:rPr>
+        <w:t xml:space="preserve"> </w:t>
+      </w:r>
+      <w:proofErr w:type="spellStart"/>
+      <w:r>
+        <w:rPr>
+          <w:rFonts w:ascii="Courier New" w:eastAsia="Courier New" w:hAnsi="Courier New" w:cs="Courier New"/>
+          <w:sz w:val="20"/>
+          <w:szCs w:val="20"/>
+        </w:rPr>
+        <w:t>previous</w:t>
+      </w:r>
+      <w:proofErr w:type="spellEnd"/>
+      <w:r>
+        <w:rPr>
+          <w:rFonts w:ascii="Courier New" w:eastAsia="Courier New" w:hAnsi="Courier New" w:cs="Courier New"/>
+          <w:sz w:val="20"/>
+          <w:szCs w:val="20"/>
+        </w:rPr>
+        <w:t xml:space="preserve"> </w:t>
+      </w:r>
+      <w:proofErr w:type="spellStart"/>
+      <w:r>
+        <w:rPr>
+          <w:rFonts w:ascii="Courier New" w:eastAsia="Courier New" w:hAnsi="Courier New" w:cs="Courier New"/>
+          <w:sz w:val="20"/>
+          <w:szCs w:val="20"/>
+        </w:rPr>
+        <w:t>state</w:t>
+      </w:r>
+      <w:proofErr w:type="spellEnd"/>
+    </w:p>
+    <w:p>
+      <w:pPr>
+        <w:spacing w:after="120" w:line="240" w:lineRule="auto"/>
+        <w:rPr>
+          <w:rFonts w:ascii="Courier New" w:eastAsia="Courier New" w:hAnsi="Courier New" w:cs="Courier New"/>
+          <w:sz w:val="20"/>
+          <w:szCs w:val="20"/>
+        </w:rPr>
+      </w:pPr>
+      <w:r>
+        <w:rPr>
+          <w:rFonts w:ascii="Courier New" w:eastAsia="Courier New" w:hAnsi="Courier New" w:cs="Courier New"/>
+          <w:sz w:val="20"/>
+          <w:szCs w:val="20"/>
+        </w:rPr>
+        <w:t xml:space="preserve">                    </w:t>
+      </w:r>
+      <w:proofErr w:type="spellStart"/>
+      <w:r>
+        <w:rPr>
+          <w:rFonts w:ascii="Courier New" w:eastAsia="Courier New" w:hAnsi="Courier New" w:cs="Courier New"/>
+          <w:sz w:val="20"/>
+          <w:szCs w:val="20"/>
+        </w:rPr>
+        <w:t>nrz_out</w:t>
+      </w:r>
+      <w:proofErr w:type="spellEnd"/>
+      <w:r>
+        <w:rPr>
+          <w:rFonts w:ascii="Courier New" w:eastAsia="Courier New" w:hAnsi="Courier New" w:cs="Courier New"/>
+          <w:sz w:val="20"/>
+          <w:szCs w:val="20"/>
+        </w:rPr>
+        <w:t xml:space="preserve"> &lt;= </w:t>
+      </w:r>
+      <w:proofErr w:type="spellStart"/>
+      <w:r>
+        <w:rPr>
+          <w:rFonts w:ascii="Courier New" w:eastAsia="Courier New" w:hAnsi="Courier New" w:cs="Courier New"/>
+          <w:sz w:val="20"/>
+          <w:szCs w:val="20"/>
+        </w:rPr>
+        <w:t>current_lvl</w:t>
+      </w:r>
+      <w:proofErr w:type="spellEnd"/>
+      <w:r>
+        <w:rPr>
+          <w:rFonts w:ascii="Courier New" w:eastAsia="Courier New" w:hAnsi="Courier New" w:cs="Courier New"/>
+          <w:sz w:val="20"/>
+          <w:szCs w:val="20"/>
+        </w:rPr>
+        <w:t>;</w:t>
+      </w:r>
+    </w:p>
+    <w:p>
+      <w:pPr>
+        <w:spacing w:after="120" w:line="240" w:lineRule="auto"/>
+        <w:rPr>
+          <w:rFonts w:ascii="Courier New" w:eastAsia="Courier New" w:hAnsi="Courier New" w:cs="Courier New"/>
+          <w:sz w:val="20"/>
+          <w:szCs w:val="20"/>
+        </w:rPr>
+      </w:pPr>
+      <w:r>
+        <w:rPr>
+          <w:rFonts w:ascii="Courier New" w:eastAsia="Courier New" w:hAnsi="Courier New" w:cs="Courier New"/>
+          <w:sz w:val="20"/>
+          <w:szCs w:val="20"/>
+        </w:rPr>
+        <w:t xml:space="preserve">                </w:t>
+      </w:r>
+      <w:proofErr w:type="spellStart"/>
+      <w:r>
+        <w:rPr>
+          <w:rFonts w:ascii="Courier New" w:eastAsia="Courier New" w:hAnsi="Courier New" w:cs="Courier New"/>
+          <w:sz w:val="20"/>
+          <w:szCs w:val="20"/>
+        </w:rPr>
+        <w:t>end</w:t>
+      </w:r>
+      <w:proofErr w:type="spellEnd"/>
+      <w:r>
+        <w:rPr>
+          <w:rFonts w:ascii="Courier New" w:eastAsia="Courier New" w:hAnsi="Courier New" w:cs="Courier New"/>
+          <w:sz w:val="20"/>
+          <w:szCs w:val="20"/>
+        </w:rPr>
+        <w:t xml:space="preserve"> if;</w:t>
+      </w:r>
+    </w:p>
+    <w:p>
+      <w:pPr>
+        <w:spacing w:after="120" w:line="240" w:lineRule="auto"/>
+        <w:rPr>
+          <w:rFonts w:ascii="Courier New" w:eastAsia="Courier New" w:hAnsi="Courier New" w:cs="Courier New"/>
+          <w:sz w:val="20"/>
+          <w:szCs w:val="20"/>
+        </w:rPr>
+      </w:pPr>
+      <w:r>
+        <w:rPr>
+          <w:rFonts w:ascii="Courier New" w:eastAsia="Courier New" w:hAnsi="Courier New" w:cs="Courier New"/>
+          <w:sz w:val="20"/>
+          <w:szCs w:val="20"/>
+        </w:rPr>
+        <w:t xml:space="preserve">            </w:t>
+      </w:r>
+      <w:proofErr w:type="spellStart"/>
+      <w:r>
+        <w:rPr>
+          <w:rFonts w:ascii="Courier New" w:eastAsia="Courier New" w:hAnsi="Courier New" w:cs="Courier New"/>
+          <w:sz w:val="20"/>
+          <w:szCs w:val="20"/>
+        </w:rPr>
+        <w:t>else</w:t>
+      </w:r>
+      <w:proofErr w:type="spellEnd"/>
+    </w:p>
+    <w:p>
+      <w:pPr>
+        <w:spacing w:after="120" w:line="240" w:lineRule="auto"/>
+        <w:rPr>
+          <w:rFonts w:ascii="Courier New" w:eastAsia="Courier New" w:hAnsi="Courier New" w:cs="Courier New"/>
+          <w:sz w:val="20"/>
+          <w:szCs w:val="20"/>
+        </w:rPr>
+      </w:pPr>
+      <w:r>
+        <w:rPr>
+          <w:rFonts w:ascii="Courier New" w:eastAsia="Courier New" w:hAnsi="Courier New" w:cs="Courier New"/>
+          <w:sz w:val="20"/>
+          <w:szCs w:val="20"/>
+        </w:rPr>
+        <w:t xml:space="preserve">                -- </w:t>
+      </w:r>
+      <w:proofErr w:type="spellStart"/>
+      <w:r>
+        <w:rPr>
+          <w:rFonts w:ascii="Courier New" w:eastAsia="Courier New" w:hAnsi="Courier New" w:cs="Courier New"/>
+          <w:sz w:val="20"/>
+          <w:szCs w:val="20"/>
+        </w:rPr>
+        <w:t>just</w:t>
+      </w:r>
+      <w:proofErr w:type="spellEnd"/>
+      <w:r>
+        <w:rPr>
+          <w:rFonts w:ascii="Courier New" w:eastAsia="Courier New" w:hAnsi="Courier New" w:cs="Courier New"/>
+          <w:sz w:val="20"/>
+          <w:szCs w:val="20"/>
+        </w:rPr>
+        <w:t xml:space="preserve"> </w:t>
+      </w:r>
+      <w:proofErr w:type="spellStart"/>
+      <w:r>
+        <w:rPr>
+          <w:rFonts w:ascii="Courier New" w:eastAsia="Courier New" w:hAnsi="Courier New" w:cs="Courier New"/>
+          <w:sz w:val="20"/>
+          <w:szCs w:val="20"/>
+        </w:rPr>
+        <w:t>hold</w:t>
+      </w:r>
+      <w:proofErr w:type="spellEnd"/>
+      <w:r>
+        <w:rPr>
+          <w:rFonts w:ascii="Courier New" w:eastAsia="Courier New" w:hAnsi="Courier New" w:cs="Courier New"/>
+          <w:sz w:val="20"/>
+          <w:szCs w:val="20"/>
+        </w:rPr>
+        <w:t xml:space="preserve"> </w:t>
+      </w:r>
+      <w:proofErr w:type="spellStart"/>
+      <w:r>
+        <w:rPr>
+          <w:rFonts w:ascii="Courier New" w:eastAsia="Courier New" w:hAnsi="Courier New" w:cs="Courier New"/>
+          <w:sz w:val="20"/>
+          <w:szCs w:val="20"/>
+        </w:rPr>
+        <w:t>the</w:t>
+      </w:r>
+      <w:proofErr w:type="spellEnd"/>
+      <w:r>
+        <w:rPr>
+          <w:rFonts w:ascii="Courier New" w:eastAsia="Courier New" w:hAnsi="Courier New" w:cs="Courier New"/>
+          <w:sz w:val="20"/>
+          <w:szCs w:val="20"/>
+        </w:rPr>
+        <w:t xml:space="preserve"> </w:t>
+      </w:r>
+      <w:proofErr w:type="spellStart"/>
+      <w:r>
+        <w:rPr>
+          <w:rFonts w:ascii="Courier New" w:eastAsia="Courier New" w:hAnsi="Courier New" w:cs="Courier New"/>
+          <w:sz w:val="20"/>
+          <w:szCs w:val="20"/>
+        </w:rPr>
+        <w:t>line</w:t>
+      </w:r>
+      <w:proofErr w:type="spellEnd"/>
+      <w:r>
+        <w:rPr>
+          <w:rFonts w:ascii="Courier New" w:eastAsia="Courier New" w:hAnsi="Courier New" w:cs="Courier New"/>
+          <w:sz w:val="20"/>
+          <w:szCs w:val="20"/>
+        </w:rPr>
+        <w:t xml:space="preserve"> </w:t>
+      </w:r>
+      <w:proofErr w:type="spellStart"/>
+      <w:r>
+        <w:rPr>
+          <w:rFonts w:ascii="Courier New" w:eastAsia="Courier New" w:hAnsi="Courier New" w:cs="Courier New"/>
+          <w:sz w:val="20"/>
+          <w:szCs w:val="20"/>
+        </w:rPr>
+        <w:t>steady</w:t>
+      </w:r>
+      <w:proofErr w:type="spellEnd"/>
+      <w:r>
+        <w:rPr>
+          <w:rFonts w:ascii="Courier New" w:eastAsia="Courier New" w:hAnsi="Courier New" w:cs="Courier New"/>
+          <w:sz w:val="20"/>
+          <w:szCs w:val="20"/>
+        </w:rPr>
+        <w:t xml:space="preserve"> for </w:t>
+      </w:r>
+      <w:proofErr w:type="spellStart"/>
+      <w:r>
+        <w:rPr>
+          <w:rFonts w:ascii="Courier New" w:eastAsia="Courier New" w:hAnsi="Courier New" w:cs="Courier New"/>
+          <w:sz w:val="20"/>
+          <w:szCs w:val="20"/>
+        </w:rPr>
+        <w:t>the</w:t>
+      </w:r>
+      <w:proofErr w:type="spellEnd"/>
+      <w:r>
+        <w:rPr>
+          <w:rFonts w:ascii="Courier New" w:eastAsia="Courier New" w:hAnsi="Courier New" w:cs="Courier New"/>
+          <w:sz w:val="20"/>
+          <w:szCs w:val="20"/>
+        </w:rPr>
+        <w:t xml:space="preserve"> </w:t>
+      </w:r>
+      <w:proofErr w:type="spellStart"/>
+      <w:r>
+        <w:rPr>
+          <w:rFonts w:ascii="Courier New" w:eastAsia="Courier New" w:hAnsi="Courier New" w:cs="Courier New"/>
+          <w:sz w:val="20"/>
+          <w:szCs w:val="20"/>
+        </w:rPr>
+        <w:t>rest</w:t>
+      </w:r>
+      <w:proofErr w:type="spellEnd"/>
+      <w:r>
+        <w:rPr>
+          <w:rFonts w:ascii="Courier New" w:eastAsia="Courier New" w:hAnsi="Courier New" w:cs="Courier New"/>
+          <w:sz w:val="20"/>
+          <w:szCs w:val="20"/>
+        </w:rPr>
+        <w:t xml:space="preserve"> </w:t>
+      </w:r>
+      <w:proofErr w:type="spellStart"/>
+      <w:r>
+        <w:rPr>
+          <w:rFonts w:ascii="Courier New" w:eastAsia="Courier New" w:hAnsi="Courier New" w:cs="Courier New"/>
+          <w:sz w:val="20"/>
+          <w:szCs w:val="20"/>
+        </w:rPr>
+        <w:t>of</w:t>
+      </w:r>
+      <w:proofErr w:type="spellEnd"/>
+      <w:r>
+        <w:rPr>
+          <w:rFonts w:ascii="Courier New" w:eastAsia="Courier New" w:hAnsi="Courier New" w:cs="Courier New"/>
+          <w:sz w:val="20"/>
+          <w:szCs w:val="20"/>
+        </w:rPr>
+        <w:t xml:space="preserve"> the bit </w:t>
+      </w:r>
+      <w:proofErr w:type="spellStart"/>
+      <w:r>
+        <w:rPr>
+          <w:rFonts w:ascii="Courier New" w:eastAsia="Courier New" w:hAnsi="Courier New" w:cs="Courier New"/>
+          <w:sz w:val="20"/>
+          <w:szCs w:val="20"/>
+        </w:rPr>
+        <w:t>duration</w:t>
+      </w:r>
+      <w:proofErr w:type="spellEnd"/>
+    </w:p>
+    <w:p>
+      <w:pPr>
+        <w:spacing w:after="120" w:line="240" w:lineRule="auto"/>
+        <w:rPr>
+          <w:rFonts w:ascii="Courier New" w:eastAsia="Courier New" w:hAnsi="Courier New" w:cs="Courier New"/>
+          <w:sz w:val="20"/>
+          <w:szCs w:val="20"/>
+        </w:rPr>
+      </w:pPr>
+      <w:r>
+        <w:rPr>
+          <w:rFonts w:ascii="Courier New" w:eastAsia="Courier New" w:hAnsi="Courier New" w:cs="Courier New"/>
+          <w:sz w:val="20"/>
+          <w:szCs w:val="20"/>
+        </w:rPr>
+        <w:t xml:space="preserve">                </w:t>
+      </w:r>
+      <w:proofErr w:type="spellStart"/>
+      <w:r>
+        <w:rPr>
+          <w:rFonts w:ascii="Courier New" w:eastAsia="Courier New" w:hAnsi="Courier New" w:cs="Courier New"/>
+          <w:sz w:val="20"/>
+          <w:szCs w:val="20"/>
+        </w:rPr>
+        <w:t>nrz_out</w:t>
+      </w:r>
+      <w:proofErr w:type="spellEnd"/>
+      <w:r>
+        <w:rPr>
+          <w:rFonts w:ascii="Courier New" w:eastAsia="Courier New" w:hAnsi="Courier New" w:cs="Courier New"/>
+          <w:sz w:val="20"/>
+          <w:szCs w:val="20"/>
+        </w:rPr>
+        <w:t xml:space="preserve"> &lt;= </w:t>
+      </w:r>
+      <w:proofErr w:type="spellStart"/>
+      <w:r>
+        <w:rPr>
+          <w:rFonts w:ascii="Courier New" w:eastAsia="Courier New" w:hAnsi="Courier New" w:cs="Courier New"/>
+          <w:sz w:val="20"/>
+          <w:szCs w:val="20"/>
+        </w:rPr>
+        <w:t>current_lvl</w:t>
+      </w:r>
+      <w:proofErr w:type="spellEnd"/>
+      <w:r>
+        <w:rPr>
+          <w:rFonts w:ascii="Courier New" w:eastAsia="Courier New" w:hAnsi="Courier New" w:cs="Courier New"/>
+          <w:sz w:val="20"/>
+          <w:szCs w:val="20"/>
+        </w:rPr>
+        <w:t>;</w:t>
+      </w:r>
+    </w:p>
+    <w:p>
+      <w:pPr>
+        <w:spacing w:after="120" w:line="240" w:lineRule="auto"/>
+        <w:rPr>
+          <w:rFonts w:ascii="Courier New" w:eastAsia="Courier New" w:hAnsi="Courier New" w:cs="Courier New"/>
+          <w:sz w:val="20"/>
+          <w:szCs w:val="20"/>
+        </w:rPr>
+      </w:pPr>
+      <w:r>
+        <w:rPr>
+          <w:rFonts w:ascii="Courier New" w:eastAsia="Courier New" w:hAnsi="Courier New" w:cs="Courier New"/>
+          <w:sz w:val="20"/>
+          <w:szCs w:val="20"/>
+        </w:rPr>
+        <w:t xml:space="preserve">            </w:t>
+      </w:r>
+      <w:proofErr w:type="spellStart"/>
+      <w:r>
+        <w:rPr>
+          <w:rFonts w:ascii="Courier New" w:eastAsia="Courier New" w:hAnsi="Courier New" w:cs="Courier New"/>
+          <w:sz w:val="20"/>
+          <w:szCs w:val="20"/>
+        </w:rPr>
+        <w:t>end</w:t>
+      </w:r>
+      <w:proofErr w:type="spellEnd"/>
+      <w:r>
+        <w:rPr>
+          <w:rFonts w:ascii="Courier New" w:eastAsia="Courier New" w:hAnsi="Courier New" w:cs="Courier New"/>
+          <w:sz w:val="20"/>
+          <w:szCs w:val="20"/>
+        </w:rPr>
+        <w:t xml:space="preserve"> if;</w:t>
+      </w:r>
+    </w:p>
+    <w:p>
+      <w:pPr>
+        <w:spacing w:after="120" w:line="240" w:lineRule="auto"/>
+        <w:rPr>
+          <w:rFonts w:ascii="Courier New" w:eastAsia="Courier New" w:hAnsi="Courier New" w:cs="Courier New"/>
+          <w:sz w:val="20"/>
+          <w:szCs w:val="20"/>
+        </w:rPr>
+      </w:pPr>
+    </w:p>
+    <w:p>
+      <w:pPr>
+        <w:spacing w:after="120" w:line="240" w:lineRule="auto"/>
+        <w:rPr>
+          <w:rFonts w:ascii="Courier New" w:eastAsia="Courier New" w:hAnsi="Courier New" w:cs="Courier New"/>
+          <w:sz w:val="20"/>
+          <w:szCs w:val="20"/>
+        </w:rPr>
+      </w:pPr>
+      <w:r>
+        <w:rPr>
+          <w:rFonts w:ascii="Courier New" w:eastAsia="Courier New" w:hAnsi="Courier New" w:cs="Courier New"/>
+          <w:sz w:val="20"/>
+          <w:szCs w:val="20"/>
+        </w:rPr>
+        <w:t xml:space="preserve">            -- </w:t>
+      </w:r>
+      <w:proofErr w:type="spellStart"/>
+      <w:r>
+        <w:rPr>
+          <w:rFonts w:ascii="Courier New" w:eastAsia="Courier New" w:hAnsi="Courier New" w:cs="Courier New"/>
+          <w:sz w:val="20"/>
+          <w:szCs w:val="20"/>
+        </w:rPr>
+        <w:t>handle</w:t>
+      </w:r>
+      <w:proofErr w:type="spellEnd"/>
+      <w:r>
+        <w:rPr>
+          <w:rFonts w:ascii="Courier New" w:eastAsia="Courier New" w:hAnsi="Courier New" w:cs="Courier New"/>
+          <w:sz w:val="20"/>
+          <w:szCs w:val="20"/>
+        </w:rPr>
+        <w:t xml:space="preserve"> </w:t>
+      </w:r>
+      <w:proofErr w:type="spellStart"/>
+      <w:r>
+        <w:rPr>
+          <w:rFonts w:ascii="Courier New" w:eastAsia="Courier New" w:hAnsi="Courier New" w:cs="Courier New"/>
+          <w:sz w:val="20"/>
+          <w:szCs w:val="20"/>
+        </w:rPr>
+        <w:t>the</w:t>
+      </w:r>
+      <w:proofErr w:type="spellEnd"/>
+      <w:r>
+        <w:rPr>
+          <w:rFonts w:ascii="Courier New" w:eastAsia="Courier New" w:hAnsi="Courier New" w:cs="Courier New"/>
+          <w:sz w:val="20"/>
+          <w:szCs w:val="20"/>
+        </w:rPr>
+        <w:t xml:space="preserve"> timing </w:t>
+      </w:r>
+      <w:proofErr w:type="spellStart"/>
+      <w:r>
+        <w:rPr>
+          <w:rFonts w:ascii="Courier New" w:eastAsia="Courier New" w:hAnsi="Courier New" w:cs="Courier New"/>
+          <w:sz w:val="20"/>
+          <w:szCs w:val="20"/>
+        </w:rPr>
+        <w:t>and</w:t>
+      </w:r>
+      <w:proofErr w:type="spellEnd"/>
+      <w:r>
+        <w:rPr>
+          <w:rFonts w:ascii="Courier New" w:eastAsia="Courier New" w:hAnsi="Courier New" w:cs="Courier New"/>
+          <w:sz w:val="20"/>
+          <w:szCs w:val="20"/>
+        </w:rPr>
+        <w:t xml:space="preserve"> pointer (</w:t>
+      </w:r>
+      <w:proofErr w:type="spellStart"/>
+      <w:r>
+        <w:rPr>
+          <w:rFonts w:ascii="Courier New" w:eastAsia="Courier New" w:hAnsi="Courier New" w:cs="Courier New"/>
+          <w:sz w:val="20"/>
+          <w:szCs w:val="20"/>
+        </w:rPr>
+        <w:t>same</w:t>
+      </w:r>
+      <w:proofErr w:type="spellEnd"/>
+      <w:r>
+        <w:rPr>
+          <w:rFonts w:ascii="Courier New" w:eastAsia="Courier New" w:hAnsi="Courier New" w:cs="Courier New"/>
+          <w:sz w:val="20"/>
+          <w:szCs w:val="20"/>
+        </w:rPr>
+        <w:t xml:space="preserve"> as </w:t>
+      </w:r>
+      <w:proofErr w:type="spellStart"/>
+      <w:r>
+        <w:rPr>
+          <w:rFonts w:ascii="Courier New" w:eastAsia="Courier New" w:hAnsi="Courier New" w:cs="Courier New"/>
+          <w:sz w:val="20"/>
+          <w:szCs w:val="20"/>
+        </w:rPr>
+        <w:t>nrz</w:t>
+      </w:r>
+      <w:proofErr w:type="spellEnd"/>
+      <w:r>
+        <w:rPr>
+          <w:rFonts w:ascii="Courier New" w:eastAsia="Courier New" w:hAnsi="Courier New" w:cs="Courier New"/>
+          <w:sz w:val="20"/>
+          <w:szCs w:val="20"/>
+        </w:rPr>
+        <w:t>-l)</w:t>
+      </w:r>
+    </w:p>
+    <w:p>
+      <w:pPr>
+        <w:spacing w:after="120" w:line="240" w:lineRule="auto"/>
+        <w:rPr>
+          <w:rFonts w:ascii="Courier New" w:eastAsia="Courier New" w:hAnsi="Courier New" w:cs="Courier New"/>
+          <w:sz w:val="20"/>
+          <w:szCs w:val="20"/>
+        </w:rPr>
+      </w:pPr>
+      <w:r>
+        <w:rPr>
+          <w:rFonts w:ascii="Courier New" w:eastAsia="Courier New" w:hAnsi="Courier New" w:cs="Courier New"/>
+          <w:sz w:val="20"/>
+          <w:szCs w:val="20"/>
+        </w:rPr>
+        <w:t xml:space="preserve">            </w:t>
+      </w:r>
+      <w:proofErr w:type="spellStart"/>
+      <w:r>
+        <w:rPr>
+          <w:rFonts w:ascii="Courier New" w:eastAsia="Courier New" w:hAnsi="Courier New" w:cs="Courier New"/>
+          <w:sz w:val="20"/>
+          <w:szCs w:val="20"/>
+        </w:rPr>
+        <w:t>if</w:t>
+      </w:r>
+      <w:proofErr w:type="spellEnd"/>
+      <w:r>
+        <w:rPr>
+          <w:rFonts w:ascii="Courier New" w:eastAsia="Courier New" w:hAnsi="Courier New" w:cs="Courier New"/>
+          <w:sz w:val="20"/>
+          <w:szCs w:val="20"/>
+        </w:rPr>
+        <w:t xml:space="preserve"> </w:t>
+      </w:r>
+      <w:proofErr w:type="spellStart"/>
+      <w:r>
+        <w:rPr>
+          <w:rFonts w:ascii="Courier New" w:eastAsia="Courier New" w:hAnsi="Courier New" w:cs="Courier New"/>
+          <w:sz w:val="20"/>
+          <w:szCs w:val="20"/>
+        </w:rPr>
+        <w:t>tick_counter</w:t>
+      </w:r>
+      <w:proofErr w:type="spellEnd"/>
+      <w:r>
+        <w:rPr>
+          <w:rFonts w:ascii="Courier New" w:eastAsia="Courier New" w:hAnsi="Courier New" w:cs="Courier New"/>
+          <w:sz w:val="20"/>
+          <w:szCs w:val="20"/>
+        </w:rPr>
+        <w:t xml:space="preserve"> &lt; TICKS_PER_BIT - 1 </w:t>
+      </w:r>
+      <w:proofErr w:type="spellStart"/>
+      <w:r>
+        <w:rPr>
+          <w:rFonts w:ascii="Courier New" w:eastAsia="Courier New" w:hAnsi="Courier New" w:cs="Courier New"/>
+          <w:sz w:val="20"/>
+          <w:szCs w:val="20"/>
+        </w:rPr>
+        <w:t>then</w:t>
+      </w:r>
+      <w:proofErr w:type="spellEnd"/>
+    </w:p>
+    <w:p>
+      <w:pPr>
+        <w:spacing w:after="120" w:line="240" w:lineRule="auto"/>
+        <w:rPr>
+          <w:rFonts w:ascii="Courier New" w:eastAsia="Courier New" w:hAnsi="Courier New" w:cs="Courier New"/>
+          <w:sz w:val="20"/>
+          <w:szCs w:val="20"/>
+        </w:rPr>
+      </w:pPr>
+      <w:r>
+        <w:rPr>
+          <w:rFonts w:ascii="Courier New" w:eastAsia="Courier New" w:hAnsi="Courier New" w:cs="Courier New"/>
+          <w:sz w:val="20"/>
+          <w:szCs w:val="20"/>
+        </w:rPr>
+        <w:t xml:space="preserve">                -- </w:t>
+      </w:r>
+      <w:proofErr w:type="spellStart"/>
+      <w:r>
+        <w:rPr>
+          <w:rFonts w:ascii="Courier New" w:eastAsia="Courier New" w:hAnsi="Courier New" w:cs="Courier New"/>
+          <w:sz w:val="20"/>
+          <w:szCs w:val="20"/>
+        </w:rPr>
+        <w:t>increment</w:t>
+      </w:r>
+      <w:proofErr w:type="spellEnd"/>
+      <w:r>
+        <w:rPr>
+          <w:rFonts w:ascii="Courier New" w:eastAsia="Courier New" w:hAnsi="Courier New" w:cs="Courier New"/>
+          <w:sz w:val="20"/>
+          <w:szCs w:val="20"/>
+        </w:rPr>
+        <w:t xml:space="preserve"> counter</w:t>
+      </w:r>
+    </w:p>
+    <w:p>
+      <w:pPr>
+        <w:spacing w:after="120" w:line="240" w:lineRule="auto"/>
+        <w:rPr>
+          <w:rFonts w:ascii="Courier New" w:eastAsia="Courier New" w:hAnsi="Courier New" w:cs="Courier New"/>
+          <w:sz w:val="20"/>
+          <w:szCs w:val="20"/>
+        </w:rPr>
+      </w:pPr>
+      <w:r>
+        <w:rPr>
+          <w:rFonts w:ascii="Courier New" w:eastAsia="Courier New" w:hAnsi="Courier New" w:cs="Courier New"/>
+          <w:sz w:val="20"/>
+          <w:szCs w:val="20"/>
+        </w:rPr>
+        <w:t xml:space="preserve">                </w:t>
+      </w:r>
+      <w:proofErr w:type="spellStart"/>
+      <w:r>
+        <w:rPr>
+          <w:rFonts w:ascii="Courier New" w:eastAsia="Courier New" w:hAnsi="Courier New" w:cs="Courier New"/>
+          <w:sz w:val="20"/>
+          <w:szCs w:val="20"/>
+        </w:rPr>
+        <w:t>tick_counter</w:t>
+      </w:r>
+      <w:proofErr w:type="spellEnd"/>
+      <w:r>
+        <w:rPr>
+          <w:rFonts w:ascii="Courier New" w:eastAsia="Courier New" w:hAnsi="Courier New" w:cs="Courier New"/>
+          <w:sz w:val="20"/>
+          <w:szCs w:val="20"/>
+        </w:rPr>
+        <w:t xml:space="preserve"> &lt;= </w:t>
+      </w:r>
+      <w:proofErr w:type="spellStart"/>
+      <w:r>
+        <w:rPr>
+          <w:rFonts w:ascii="Courier New" w:eastAsia="Courier New" w:hAnsi="Courier New" w:cs="Courier New"/>
+          <w:sz w:val="20"/>
+          <w:szCs w:val="20"/>
+        </w:rPr>
+        <w:t>tick_counter</w:t>
+      </w:r>
+      <w:proofErr w:type="spellEnd"/>
+      <w:r>
+        <w:rPr>
+          <w:rFonts w:ascii="Courier New" w:eastAsia="Courier New" w:hAnsi="Courier New" w:cs="Courier New"/>
+          <w:sz w:val="20"/>
+          <w:szCs w:val="20"/>
+        </w:rPr>
+        <w:t xml:space="preserve"> + 1;</w:t>
+      </w:r>
+    </w:p>
+    <w:p>
+      <w:pPr>
+        <w:spacing w:after="120" w:line="240" w:lineRule="auto"/>
+        <w:rPr>
+          <w:rFonts w:ascii="Courier New" w:eastAsia="Courier New" w:hAnsi="Courier New" w:cs="Courier New"/>
+          <w:sz w:val="20"/>
+          <w:szCs w:val="20"/>
+        </w:rPr>
+      </w:pPr>
+      <w:r>
+        <w:rPr>
+          <w:rFonts w:ascii="Courier New" w:eastAsia="Courier New" w:hAnsi="Courier New" w:cs="Courier New"/>
+          <w:sz w:val="20"/>
+          <w:szCs w:val="20"/>
+        </w:rPr>
+        <w:t xml:space="preserve">            </w:t>
+      </w:r>
+      <w:proofErr w:type="spellStart"/>
+      <w:r>
+        <w:rPr>
+          <w:rFonts w:ascii="Courier New" w:eastAsia="Courier New" w:hAnsi="Courier New" w:cs="Courier New"/>
+          <w:sz w:val="20"/>
+          <w:szCs w:val="20"/>
+        </w:rPr>
+        <w:t>else</w:t>
+      </w:r>
+      <w:proofErr w:type="spellEnd"/>
+    </w:p>
+    <w:p>
+      <w:pPr>
+        <w:spacing w:after="120" w:line="240" w:lineRule="auto"/>
+        <w:rPr>
+          <w:rFonts w:ascii="Courier New" w:eastAsia="Courier New" w:hAnsi="Courier New" w:cs="Courier New"/>
+          <w:sz w:val="20"/>
+          <w:szCs w:val="20"/>
+        </w:rPr>
+      </w:pPr>
+      <w:r>
+        <w:rPr>
+          <w:rFonts w:ascii="Courier New" w:eastAsia="Courier New" w:hAnsi="Courier New" w:cs="Courier New"/>
+          <w:sz w:val="20"/>
+          <w:szCs w:val="20"/>
+        </w:rPr>
+        <w:t xml:space="preserve">                -- reset </w:t>
+      </w:r>
+      <w:proofErr w:type="spellStart"/>
+      <w:r>
+        <w:rPr>
+          <w:rFonts w:ascii="Courier New" w:eastAsia="Courier New" w:hAnsi="Courier New" w:cs="Courier New"/>
+          <w:sz w:val="20"/>
+          <w:szCs w:val="20"/>
+        </w:rPr>
+        <w:t>the</w:t>
+      </w:r>
+      <w:proofErr w:type="spellEnd"/>
+      <w:r>
+        <w:rPr>
+          <w:rFonts w:ascii="Courier New" w:eastAsia="Courier New" w:hAnsi="Courier New" w:cs="Courier New"/>
+          <w:sz w:val="20"/>
+          <w:szCs w:val="20"/>
+        </w:rPr>
+        <w:t xml:space="preserve"> counter</w:t>
+      </w:r>
+    </w:p>
+    <w:p>
+      <w:pPr>
+        <w:spacing w:after="120" w:line="240" w:lineRule="auto"/>
+        <w:rPr>
+          <w:rFonts w:ascii="Courier New" w:eastAsia="Courier New" w:hAnsi="Courier New" w:cs="Courier New"/>
+          <w:sz w:val="20"/>
+          <w:szCs w:val="20"/>
+        </w:rPr>
+      </w:pPr>
+      <w:r>
+        <w:rPr>
+          <w:rFonts w:ascii="Courier New" w:eastAsia="Courier New" w:hAnsi="Courier New" w:cs="Courier New"/>
+          <w:sz w:val="20"/>
+          <w:szCs w:val="20"/>
+        </w:rPr>
+        <w:t xml:space="preserve">                </w:t>
+      </w:r>
+      <w:proofErr w:type="spellStart"/>
+      <w:r>
+        <w:rPr>
+          <w:rFonts w:ascii="Courier New" w:eastAsia="Courier New" w:hAnsi="Courier New" w:cs="Courier New"/>
+          <w:sz w:val="20"/>
+          <w:szCs w:val="20"/>
+        </w:rPr>
+        <w:t>tick_counter</w:t>
+      </w:r>
+      <w:proofErr w:type="spellEnd"/>
+      <w:r>
+        <w:rPr>
+          <w:rFonts w:ascii="Courier New" w:eastAsia="Courier New" w:hAnsi="Courier New" w:cs="Courier New"/>
+          <w:sz w:val="20"/>
+          <w:szCs w:val="20"/>
+        </w:rPr>
+        <w:t xml:space="preserve"> &lt;= 0;</w:t>
+      </w:r>
+    </w:p>
+    <w:p>
+      <w:pPr>
+        <w:spacing w:after="120" w:line="240" w:lineRule="auto"/>
+        <w:rPr>
+          <w:rFonts w:ascii="Courier New" w:eastAsia="Courier New" w:hAnsi="Courier New" w:cs="Courier New"/>
+          <w:sz w:val="20"/>
+          <w:szCs w:val="20"/>
+        </w:rPr>
+      </w:pPr>
+      <w:r>
+        <w:rPr>
+          <w:rFonts w:ascii="Courier New" w:eastAsia="Courier New" w:hAnsi="Courier New" w:cs="Courier New"/>
+          <w:sz w:val="20"/>
+          <w:szCs w:val="20"/>
+        </w:rPr>
+        <w:t xml:space="preserve">                </w:t>
+      </w:r>
+    </w:p>
+    <w:p>
+      <w:pPr>
+        <w:spacing w:after="120" w:line="240" w:lineRule="auto"/>
+        <w:rPr>
+          <w:rFonts w:ascii="Courier New" w:eastAsia="Courier New" w:hAnsi="Courier New" w:cs="Courier New"/>
+          <w:sz w:val="20"/>
+          <w:szCs w:val="20"/>
+        </w:rPr>
+      </w:pPr>
+      <w:r>
+        <w:rPr>
+          <w:rFonts w:ascii="Courier New" w:eastAsia="Courier New" w:hAnsi="Courier New" w:cs="Courier New"/>
+          <w:sz w:val="20"/>
+          <w:szCs w:val="20"/>
+        </w:rPr>
+        <w:t xml:space="preserve">                </w:t>
+      </w:r>
+      <w:proofErr w:type="spellStart"/>
+      <w:r>
+        <w:rPr>
+          <w:rFonts w:ascii="Courier New" w:eastAsia="Courier New" w:hAnsi="Courier New" w:cs="Courier New"/>
+          <w:sz w:val="20"/>
+          <w:szCs w:val="20"/>
+        </w:rPr>
+        <w:t>if</w:t>
+      </w:r>
+      <w:proofErr w:type="spellEnd"/>
+      <w:r>
+        <w:rPr>
+          <w:rFonts w:ascii="Courier New" w:eastAsia="Courier New" w:hAnsi="Courier New" w:cs="Courier New"/>
+          <w:sz w:val="20"/>
+          <w:szCs w:val="20"/>
+        </w:rPr>
+        <w:t xml:space="preserve"> </w:t>
+      </w:r>
+      <w:proofErr w:type="spellStart"/>
+      <w:r>
+        <w:rPr>
+          <w:rFonts w:ascii="Courier New" w:eastAsia="Courier New" w:hAnsi="Courier New" w:cs="Courier New"/>
+          <w:sz w:val="20"/>
+          <w:szCs w:val="20"/>
+        </w:rPr>
+        <w:t>bit_ptr</w:t>
+      </w:r>
+      <w:proofErr w:type="spellEnd"/>
+      <w:r>
+        <w:rPr>
+          <w:rFonts w:ascii="Courier New" w:eastAsia="Courier New" w:hAnsi="Courier New" w:cs="Courier New"/>
+          <w:sz w:val="20"/>
+          <w:szCs w:val="20"/>
+        </w:rPr>
+        <w:t xml:space="preserve"> = 0 </w:t>
+      </w:r>
+      <w:proofErr w:type="spellStart"/>
+      <w:r>
+        <w:rPr>
+          <w:rFonts w:ascii="Courier New" w:eastAsia="Courier New" w:hAnsi="Courier New" w:cs="Courier New"/>
+          <w:sz w:val="20"/>
+          <w:szCs w:val="20"/>
+        </w:rPr>
+        <w:t>then</w:t>
+      </w:r>
+      <w:proofErr w:type="spellEnd"/>
+    </w:p>
+    <w:p>
+      <w:pPr>
+        <w:spacing w:after="120" w:line="240" w:lineRule="auto"/>
+        <w:rPr>
+          <w:rFonts w:ascii="Courier New" w:eastAsia="Courier New" w:hAnsi="Courier New" w:cs="Courier New"/>
+          <w:sz w:val="20"/>
+          <w:szCs w:val="20"/>
+        </w:rPr>
+      </w:pPr>
+      <w:r>
+        <w:rPr>
+          <w:rFonts w:ascii="Courier New" w:eastAsia="Courier New" w:hAnsi="Courier New" w:cs="Courier New"/>
+          <w:sz w:val="20"/>
+          <w:szCs w:val="20"/>
+        </w:rPr>
+        <w:t xml:space="preserve">                    -- loop </w:t>
+      </w:r>
+      <w:proofErr w:type="spellStart"/>
+      <w:r>
+        <w:rPr>
+          <w:rFonts w:ascii="Courier New" w:eastAsia="Courier New" w:hAnsi="Courier New" w:cs="Courier New"/>
+          <w:sz w:val="20"/>
+          <w:szCs w:val="20"/>
+        </w:rPr>
+        <w:t>if</w:t>
+      </w:r>
+      <w:proofErr w:type="spellEnd"/>
+      <w:r>
+        <w:rPr>
+          <w:rFonts w:ascii="Courier New" w:eastAsia="Courier New" w:hAnsi="Courier New" w:cs="Courier New"/>
+          <w:sz w:val="20"/>
+          <w:szCs w:val="20"/>
+        </w:rPr>
+        <w:t xml:space="preserve"> data </w:t>
+      </w:r>
+      <w:proofErr w:type="spellStart"/>
+      <w:r>
+        <w:rPr>
+          <w:rFonts w:ascii="Courier New" w:eastAsia="Courier New" w:hAnsi="Courier New" w:cs="Courier New"/>
+          <w:sz w:val="20"/>
+          <w:szCs w:val="20"/>
+        </w:rPr>
+        <w:t>finished</w:t>
+      </w:r>
+      <w:proofErr w:type="spellEnd"/>
+      <w:r>
+        <w:rPr>
+          <w:rFonts w:ascii="Courier New" w:eastAsia="Courier New" w:hAnsi="Courier New" w:cs="Courier New"/>
+          <w:sz w:val="20"/>
+          <w:szCs w:val="20"/>
+        </w:rPr>
+        <w:t xml:space="preserve"> </w:t>
+      </w:r>
+      <w:proofErr w:type="spellStart"/>
+      <w:r>
+        <w:rPr>
+          <w:rFonts w:ascii="Courier New" w:eastAsia="Courier New" w:hAnsi="Courier New" w:cs="Courier New"/>
+          <w:sz w:val="20"/>
+          <w:szCs w:val="20"/>
+        </w:rPr>
+        <w:t>being</w:t>
+      </w:r>
+      <w:proofErr w:type="spellEnd"/>
+      <w:r>
+        <w:rPr>
+          <w:rFonts w:ascii="Courier New" w:eastAsia="Courier New" w:hAnsi="Courier New" w:cs="Courier New"/>
+          <w:sz w:val="20"/>
+          <w:szCs w:val="20"/>
+        </w:rPr>
+        <w:t xml:space="preserve"> </w:t>
+      </w:r>
+      <w:proofErr w:type="spellStart"/>
+      <w:r>
+        <w:rPr>
+          <w:rFonts w:ascii="Courier New" w:eastAsia="Courier New" w:hAnsi="Courier New" w:cs="Courier New"/>
+          <w:sz w:val="20"/>
+          <w:szCs w:val="20"/>
+        </w:rPr>
+        <w:t>read</w:t>
+      </w:r>
+      <w:proofErr w:type="spellEnd"/>
+    </w:p>
+    <w:p>
+      <w:pPr>
+        <w:spacing w:after="120" w:line="240" w:lineRule="auto"/>
+        <w:rPr>
+          <w:rFonts w:ascii="Courier New" w:eastAsia="Courier New" w:hAnsi="Courier New" w:cs="Courier New"/>
+          <w:sz w:val="20"/>
+          <w:szCs w:val="20"/>
+        </w:rPr>
+      </w:pPr>
+      <w:r>
+        <w:rPr>
+          <w:rFonts w:ascii="Courier New" w:eastAsia="Courier New" w:hAnsi="Courier New" w:cs="Courier New"/>
+          <w:sz w:val="20"/>
+          <w:szCs w:val="20"/>
+        </w:rPr>
+        <w:t xml:space="preserve">                    </w:t>
+      </w:r>
+      <w:proofErr w:type="spellStart"/>
+      <w:r>
+        <w:rPr>
+          <w:rFonts w:ascii="Courier New" w:eastAsia="Courier New" w:hAnsi="Courier New" w:cs="Courier New"/>
+          <w:sz w:val="20"/>
+          <w:szCs w:val="20"/>
+        </w:rPr>
+        <w:t>bit_ptr</w:t>
+      </w:r>
+      <w:proofErr w:type="spellEnd"/>
+      <w:r>
+        <w:rPr>
+          <w:rFonts w:ascii="Courier New" w:eastAsia="Courier New" w:hAnsi="Courier New" w:cs="Courier New"/>
+          <w:sz w:val="20"/>
+          <w:szCs w:val="20"/>
+        </w:rPr>
+        <w:t xml:space="preserve"> &lt;= DATA_WIDTH - 1;</w:t>
+      </w:r>
+    </w:p>
+    <w:p>
+      <w:pPr>
+        <w:spacing w:after="120" w:line="240" w:lineRule="auto"/>
+        <w:rPr>
+          <w:rFonts w:ascii="Courier New" w:eastAsia="Courier New" w:hAnsi="Courier New" w:cs="Courier New"/>
+          <w:sz w:val="20"/>
+          <w:szCs w:val="20"/>
+        </w:rPr>
+      </w:pPr>
+      <w:r>
+        <w:rPr>
+          <w:rFonts w:ascii="Courier New" w:eastAsia="Courier New" w:hAnsi="Courier New" w:cs="Courier New"/>
+          <w:sz w:val="20"/>
+          <w:szCs w:val="20"/>
+        </w:rPr>
+        <w:t xml:space="preserve">                </w:t>
+      </w:r>
+      <w:proofErr w:type="spellStart"/>
+      <w:r>
+        <w:rPr>
+          <w:rFonts w:ascii="Courier New" w:eastAsia="Courier New" w:hAnsi="Courier New" w:cs="Courier New"/>
+          <w:sz w:val="20"/>
+          <w:szCs w:val="20"/>
+        </w:rPr>
+        <w:t>else</w:t>
+      </w:r>
+      <w:proofErr w:type="spellEnd"/>
+    </w:p>
+    <w:p>
+      <w:pPr>
+        <w:spacing w:after="120" w:line="240" w:lineRule="auto"/>
+        <w:rPr>
+          <w:rFonts w:ascii="Courier New" w:eastAsia="Courier New" w:hAnsi="Courier New" w:cs="Courier New"/>
+          <w:sz w:val="20"/>
+          <w:szCs w:val="20"/>
+        </w:rPr>
+      </w:pPr>
+      <w:r>
+        <w:rPr>
+          <w:rFonts w:ascii="Courier New" w:eastAsia="Courier New" w:hAnsi="Courier New" w:cs="Courier New"/>
+          <w:sz w:val="20"/>
+          <w:szCs w:val="20"/>
+        </w:rPr>
+        <w:t xml:space="preserve">                    -- move </w:t>
+      </w:r>
+      <w:proofErr w:type="spellStart"/>
+      <w:r>
+        <w:rPr>
+          <w:rFonts w:ascii="Courier New" w:eastAsia="Courier New" w:hAnsi="Courier New" w:cs="Courier New"/>
+          <w:sz w:val="20"/>
+          <w:szCs w:val="20"/>
+        </w:rPr>
+        <w:t>on</w:t>
+      </w:r>
+      <w:proofErr w:type="spellEnd"/>
+      <w:r>
+        <w:rPr>
+          <w:rFonts w:ascii="Courier New" w:eastAsia="Courier New" w:hAnsi="Courier New" w:cs="Courier New"/>
+          <w:sz w:val="20"/>
+          <w:szCs w:val="20"/>
+        </w:rPr>
+        <w:t xml:space="preserve"> </w:t>
+      </w:r>
+      <w:proofErr w:type="spellStart"/>
+      <w:r>
+        <w:rPr>
+          <w:rFonts w:ascii="Courier New" w:eastAsia="Courier New" w:hAnsi="Courier New" w:cs="Courier New"/>
+          <w:sz w:val="20"/>
+          <w:szCs w:val="20"/>
+        </w:rPr>
+        <w:t>to</w:t>
+      </w:r>
+      <w:proofErr w:type="spellEnd"/>
+      <w:r>
+        <w:rPr>
+          <w:rFonts w:ascii="Courier New" w:eastAsia="Courier New" w:hAnsi="Courier New" w:cs="Courier New"/>
+          <w:sz w:val="20"/>
+          <w:szCs w:val="20"/>
+        </w:rPr>
+        <w:t xml:space="preserve"> </w:t>
+      </w:r>
+      <w:proofErr w:type="spellStart"/>
+      <w:r>
+        <w:rPr>
+          <w:rFonts w:ascii="Courier New" w:eastAsia="Courier New" w:hAnsi="Courier New" w:cs="Courier New"/>
+          <w:sz w:val="20"/>
+          <w:szCs w:val="20"/>
+        </w:rPr>
+        <w:t>the</w:t>
+      </w:r>
+      <w:proofErr w:type="spellEnd"/>
+      <w:r>
+        <w:rPr>
+          <w:rFonts w:ascii="Courier New" w:eastAsia="Courier New" w:hAnsi="Courier New" w:cs="Courier New"/>
+          <w:sz w:val="20"/>
+          <w:szCs w:val="20"/>
+        </w:rPr>
+        <w:t xml:space="preserve"> </w:t>
+      </w:r>
+      <w:proofErr w:type="spellStart"/>
+      <w:r>
+        <w:rPr>
+          <w:rFonts w:ascii="Courier New" w:eastAsia="Courier New" w:hAnsi="Courier New" w:cs="Courier New"/>
+          <w:sz w:val="20"/>
+          <w:szCs w:val="20"/>
+        </w:rPr>
+        <w:t>next</w:t>
+      </w:r>
+      <w:proofErr w:type="spellEnd"/>
+      <w:r>
+        <w:rPr>
+          <w:rFonts w:ascii="Courier New" w:eastAsia="Courier New" w:hAnsi="Courier New" w:cs="Courier New"/>
+          <w:sz w:val="20"/>
+          <w:szCs w:val="20"/>
+        </w:rPr>
+        <w:t xml:space="preserve"> bit </w:t>
+      </w:r>
+      <w:proofErr w:type="spellStart"/>
+      <w:r>
+        <w:rPr>
+          <w:rFonts w:ascii="Courier New" w:eastAsia="Courier New" w:hAnsi="Courier New" w:cs="Courier New"/>
+          <w:sz w:val="20"/>
+          <w:szCs w:val="20"/>
+        </w:rPr>
+        <w:t>down</w:t>
+      </w:r>
+      <w:proofErr w:type="spellEnd"/>
+    </w:p>
+    <w:p>
+      <w:pPr>
+        <w:spacing w:after="120" w:line="240" w:lineRule="auto"/>
+        <w:rPr>
+          <w:rFonts w:ascii="Courier New" w:eastAsia="Courier New" w:hAnsi="Courier New" w:cs="Courier New"/>
+          <w:sz w:val="20"/>
+          <w:szCs w:val="20"/>
+        </w:rPr>
+      </w:pPr>
+      <w:r>
+        <w:rPr>
+          <w:rFonts w:ascii="Courier New" w:eastAsia="Courier New" w:hAnsi="Courier New" w:cs="Courier New"/>
+          <w:sz w:val="20"/>
+          <w:szCs w:val="20"/>
+        </w:rPr>
+        <w:t xml:space="preserve">                    </w:t>
+      </w:r>
+      <w:proofErr w:type="spellStart"/>
+      <w:r>
+        <w:rPr>
+          <w:rFonts w:ascii="Courier New" w:eastAsia="Courier New" w:hAnsi="Courier New" w:cs="Courier New"/>
+          <w:sz w:val="20"/>
+          <w:szCs w:val="20"/>
+        </w:rPr>
+        <w:t>bit_ptr</w:t>
+      </w:r>
+      <w:proofErr w:type="spellEnd"/>
+      <w:r>
+        <w:rPr>
+          <w:rFonts w:ascii="Courier New" w:eastAsia="Courier New" w:hAnsi="Courier New" w:cs="Courier New"/>
+          <w:sz w:val="20"/>
+          <w:szCs w:val="20"/>
+        </w:rPr>
+        <w:t xml:space="preserve"> &lt;= </w:t>
+      </w:r>
+      <w:proofErr w:type="spellStart"/>
+      <w:r>
+        <w:rPr>
+          <w:rFonts w:ascii="Courier New" w:eastAsia="Courier New" w:hAnsi="Courier New" w:cs="Courier New"/>
+          <w:sz w:val="20"/>
+          <w:szCs w:val="20"/>
+        </w:rPr>
+        <w:t>bit_ptr</w:t>
+      </w:r>
+      <w:proofErr w:type="spellEnd"/>
+      <w:r>
+        <w:rPr>
+          <w:rFonts w:ascii="Courier New" w:eastAsia="Courier New" w:hAnsi="Courier New" w:cs="Courier New"/>
+          <w:sz w:val="20"/>
+          <w:szCs w:val="20"/>
+        </w:rPr>
+        <w:t xml:space="preserve"> - 1;</w:t>
+      </w:r>
+    </w:p>
+    <w:p>
+      <w:pPr>
+        <w:spacing w:after="120" w:line="240" w:lineRule="auto"/>
+        <w:rPr>
+          <w:rFonts w:ascii="Courier New" w:eastAsia="Courier New" w:hAnsi="Courier New" w:cs="Courier New"/>
+          <w:sz w:val="20"/>
+          <w:szCs w:val="20"/>
+        </w:rPr>
+      </w:pPr>
+      <w:r>
+        <w:rPr>
+          <w:rFonts w:ascii="Courier New" w:eastAsia="Courier New" w:hAnsi="Courier New" w:cs="Courier New"/>
+          <w:sz w:val="20"/>
+          <w:szCs w:val="20"/>
+        </w:rPr>
         <w:lastRenderedPageBreak/>
-        <w:t xml:space="preserve">            -- clean </w:t>
-      </w:r>
-      <w:proofErr w:type="spellStart"/>
-      <w:r>
-        <w:rPr>
-          <w:rFonts w:ascii="Courier New" w:eastAsia="Courier New" w:hAnsi="Courier New" w:cs="Courier New"/>
-          <w:sz w:val="20"/>
-          <w:szCs w:val="20"/>
-        </w:rPr>
-        <w:t>slate</w:t>
-      </w:r>
-      <w:proofErr w:type="spellEnd"/>
-      <w:r>
-        <w:rPr>
-          <w:rFonts w:ascii="Courier New" w:eastAsia="Courier New" w:hAnsi="Courier New" w:cs="Courier New"/>
-          <w:sz w:val="20"/>
-          <w:szCs w:val="20"/>
-        </w:rPr>
-        <w:t xml:space="preserve"> on reset</w:t>
-      </w:r>
-    </w:p>
-    <w:p>
-      <w:pPr>
-        <w:spacing w:after="120" w:line="240" w:lineRule="auto"/>
-        <w:rPr>
-          <w:rFonts w:ascii="Courier New" w:eastAsia="Courier New" w:hAnsi="Courier New" w:cs="Courier New"/>
-          <w:sz w:val="20"/>
-          <w:szCs w:val="20"/>
-        </w:rPr>
-      </w:pPr>
-      <w:r>
-        <w:rPr>
-          <w:rFonts w:ascii="Courier New" w:eastAsia="Courier New" w:hAnsi="Courier New" w:cs="Courier New"/>
-          <w:sz w:val="20"/>
-          <w:szCs w:val="20"/>
-        </w:rPr>
-        <w:t xml:space="preserve">            </w:t>
-      </w:r>
-      <w:proofErr w:type="spellStart"/>
-      <w:r>
-        <w:rPr>
-          <w:rFonts w:ascii="Courier New" w:eastAsia="Courier New" w:hAnsi="Courier New" w:cs="Courier New"/>
-          <w:sz w:val="20"/>
-          <w:szCs w:val="20"/>
-        </w:rPr>
-        <w:t>bit_ptr</w:t>
-      </w:r>
-      <w:proofErr w:type="spellEnd"/>
-      <w:r>
-        <w:rPr>
-          <w:rFonts w:ascii="Courier New" w:eastAsia="Courier New" w:hAnsi="Courier New" w:cs="Courier New"/>
-          <w:sz w:val="20"/>
-          <w:szCs w:val="20"/>
-        </w:rPr>
-        <w:t xml:space="preserve"> &lt;= DATA_WIDTH - 1;</w:t>
-      </w:r>
-    </w:p>
-    <w:p>
-      <w:pPr>
-        <w:spacing w:after="120" w:line="240" w:lineRule="auto"/>
-        <w:rPr>
-          <w:rFonts w:ascii="Courier New" w:eastAsia="Courier New" w:hAnsi="Courier New" w:cs="Courier New"/>
-          <w:sz w:val="20"/>
-          <w:szCs w:val="20"/>
-        </w:rPr>
-      </w:pPr>
-      <w:r>
-        <w:rPr>
-          <w:rFonts w:ascii="Courier New" w:eastAsia="Courier New" w:hAnsi="Courier New" w:cs="Courier New"/>
-          <w:sz w:val="20"/>
-          <w:szCs w:val="20"/>
-        </w:rPr>
-        <w:t xml:space="preserve">            </w:t>
-      </w:r>
-      <w:proofErr w:type="spellStart"/>
-      <w:r>
-        <w:rPr>
-          <w:rFonts w:ascii="Courier New" w:eastAsia="Courier New" w:hAnsi="Courier New" w:cs="Courier New"/>
-          <w:sz w:val="20"/>
-          <w:szCs w:val="20"/>
-        </w:rPr>
-        <w:t>tick_counter</w:t>
-      </w:r>
-      <w:proofErr w:type="spellEnd"/>
-      <w:r>
-        <w:rPr>
-          <w:rFonts w:ascii="Courier New" w:eastAsia="Courier New" w:hAnsi="Courier New" w:cs="Courier New"/>
-          <w:sz w:val="20"/>
-          <w:szCs w:val="20"/>
-        </w:rPr>
-        <w:t xml:space="preserve"> &lt;= 0;</w:t>
-      </w:r>
-    </w:p>
-    <w:p>
-      <w:pPr>
-        <w:spacing w:after="120" w:line="240" w:lineRule="auto"/>
-        <w:rPr>
-          <w:rFonts w:ascii="Courier New" w:eastAsia="Courier New" w:hAnsi="Courier New" w:cs="Courier New"/>
-          <w:sz w:val="20"/>
-          <w:szCs w:val="20"/>
-        </w:rPr>
-      </w:pPr>
-      <w:r>
-        <w:rPr>
-          <w:rFonts w:ascii="Courier New" w:eastAsia="Courier New" w:hAnsi="Courier New" w:cs="Courier New"/>
-          <w:sz w:val="20"/>
-          <w:szCs w:val="20"/>
-        </w:rPr>
-        <w:t xml:space="preserve">            </w:t>
-      </w:r>
-      <w:proofErr w:type="spellStart"/>
-      <w:r>
-        <w:rPr>
-          <w:rFonts w:ascii="Courier New" w:eastAsia="Courier New" w:hAnsi="Courier New" w:cs="Courier New"/>
-          <w:sz w:val="20"/>
-          <w:szCs w:val="20"/>
-        </w:rPr>
-        <w:t>current_lvl</w:t>
-      </w:r>
-      <w:proofErr w:type="spellEnd"/>
-      <w:r>
-        <w:rPr>
-          <w:rFonts w:ascii="Courier New" w:eastAsia="Courier New" w:hAnsi="Courier New" w:cs="Courier New"/>
-          <w:sz w:val="20"/>
-          <w:szCs w:val="20"/>
-        </w:rPr>
-        <w:t xml:space="preserve"> &lt;= '0';</w:t>
-      </w:r>
-    </w:p>
-    <w:p>
-      <w:pPr>
-        <w:spacing w:after="120" w:line="240" w:lineRule="auto"/>
-        <w:rPr>
-          <w:rFonts w:ascii="Courier New" w:eastAsia="Courier New" w:hAnsi="Courier New" w:cs="Courier New"/>
-          <w:sz w:val="20"/>
-          <w:szCs w:val="20"/>
-        </w:rPr>
-      </w:pPr>
-      <w:r>
-        <w:rPr>
-          <w:rFonts w:ascii="Courier New" w:eastAsia="Courier New" w:hAnsi="Courier New" w:cs="Courier New"/>
-          <w:sz w:val="20"/>
-          <w:szCs w:val="20"/>
-        </w:rPr>
-        <w:t xml:space="preserve">            </w:t>
-      </w:r>
-      <w:proofErr w:type="spellStart"/>
-      <w:r>
-        <w:rPr>
-          <w:rFonts w:ascii="Courier New" w:eastAsia="Courier New" w:hAnsi="Courier New" w:cs="Courier New"/>
-          <w:sz w:val="20"/>
-          <w:szCs w:val="20"/>
-        </w:rPr>
-        <w:t>nrz_out</w:t>
-      </w:r>
-      <w:proofErr w:type="spellEnd"/>
-      <w:r>
-        <w:rPr>
-          <w:rFonts w:ascii="Courier New" w:eastAsia="Courier New" w:hAnsi="Courier New" w:cs="Courier New"/>
-          <w:sz w:val="20"/>
-          <w:szCs w:val="20"/>
-        </w:rPr>
-        <w:t xml:space="preserve"> &lt;= '0';</w:t>
-      </w:r>
-    </w:p>
-    <w:p>
-      <w:pPr>
-        <w:spacing w:after="120" w:line="240" w:lineRule="auto"/>
-        <w:rPr>
-          <w:rFonts w:ascii="Courier New" w:eastAsia="Courier New" w:hAnsi="Courier New" w:cs="Courier New"/>
-          <w:sz w:val="20"/>
-          <w:szCs w:val="20"/>
-        </w:rPr>
-      </w:pPr>
-      <w:r>
-        <w:rPr>
-          <w:rFonts w:ascii="Courier New" w:eastAsia="Courier New" w:hAnsi="Courier New" w:cs="Courier New"/>
-          <w:sz w:val="20"/>
-          <w:szCs w:val="20"/>
-        </w:rPr>
-        <w:t xml:space="preserve">        </w:t>
-      </w:r>
-      <w:proofErr w:type="spellStart"/>
-      <w:r>
-        <w:rPr>
-          <w:rFonts w:ascii="Courier New" w:eastAsia="Courier New" w:hAnsi="Courier New" w:cs="Courier New"/>
-          <w:sz w:val="20"/>
-          <w:szCs w:val="20"/>
-        </w:rPr>
-        <w:t>elsif</w:t>
-      </w:r>
-      <w:proofErr w:type="spellEnd"/>
-      <w:r>
-        <w:rPr>
-          <w:rFonts w:ascii="Courier New" w:eastAsia="Courier New" w:hAnsi="Courier New" w:cs="Courier New"/>
-          <w:sz w:val="20"/>
-          <w:szCs w:val="20"/>
-        </w:rPr>
-        <w:t xml:space="preserve"> rising_edge(clk) </w:t>
-      </w:r>
-      <w:proofErr w:type="spellStart"/>
-      <w:r>
-        <w:rPr>
-          <w:rFonts w:ascii="Courier New" w:eastAsia="Courier New" w:hAnsi="Courier New" w:cs="Courier New"/>
-          <w:sz w:val="20"/>
-          <w:szCs w:val="20"/>
-        </w:rPr>
-        <w:t>then</w:t>
-      </w:r>
-      <w:proofErr w:type="spellEnd"/>
-    </w:p>
-    <w:p>
-      <w:pPr>
-        <w:spacing w:after="120" w:line="240" w:lineRule="auto"/>
-        <w:rPr>
-          <w:rFonts w:ascii="Courier New" w:eastAsia="Courier New" w:hAnsi="Courier New" w:cs="Courier New"/>
-          <w:sz w:val="20"/>
-          <w:szCs w:val="20"/>
-        </w:rPr>
-      </w:pPr>
-      <w:r>
-        <w:rPr>
-          <w:rFonts w:ascii="Courier New" w:eastAsia="Courier New" w:hAnsi="Courier New" w:cs="Courier New"/>
-          <w:sz w:val="20"/>
-          <w:szCs w:val="20"/>
-        </w:rPr>
-        <w:t xml:space="preserve">            </w:t>
-      </w:r>
-    </w:p>
-    <w:p>
-      <w:pPr>
-        <w:spacing w:after="120" w:line="240" w:lineRule="auto"/>
-        <w:rPr>
-          <w:rFonts w:ascii="Courier New" w:eastAsia="Courier New" w:hAnsi="Courier New" w:cs="Courier New"/>
-          <w:sz w:val="20"/>
-          <w:szCs w:val="20"/>
-        </w:rPr>
-      </w:pPr>
-      <w:r>
-        <w:rPr>
-          <w:rFonts w:ascii="Courier New" w:eastAsia="Courier New" w:hAnsi="Courier New" w:cs="Courier New"/>
-          <w:sz w:val="20"/>
-          <w:szCs w:val="20"/>
-        </w:rPr>
-        <w:t xml:space="preserve">            -- </w:t>
-      </w:r>
-      <w:proofErr w:type="spellStart"/>
-      <w:r>
-        <w:rPr>
-          <w:rFonts w:ascii="Courier New" w:eastAsia="Courier New" w:hAnsi="Courier New" w:cs="Courier New"/>
-          <w:sz w:val="20"/>
-          <w:szCs w:val="20"/>
-        </w:rPr>
-        <w:t>nrzi</w:t>
-      </w:r>
-      <w:proofErr w:type="spellEnd"/>
-      <w:r>
-        <w:rPr>
-          <w:rFonts w:ascii="Courier New" w:eastAsia="Courier New" w:hAnsi="Courier New" w:cs="Courier New"/>
-          <w:sz w:val="20"/>
-          <w:szCs w:val="20"/>
-        </w:rPr>
-        <w:t xml:space="preserve"> </w:t>
-      </w:r>
-      <w:proofErr w:type="spellStart"/>
-      <w:r>
-        <w:rPr>
-          <w:rFonts w:ascii="Courier New" w:eastAsia="Courier New" w:hAnsi="Courier New" w:cs="Courier New"/>
-          <w:sz w:val="20"/>
-          <w:szCs w:val="20"/>
-        </w:rPr>
-        <w:t>logic</w:t>
-      </w:r>
-      <w:proofErr w:type="spellEnd"/>
-      <w:r>
-        <w:rPr>
-          <w:rFonts w:ascii="Courier New" w:eastAsia="Courier New" w:hAnsi="Courier New" w:cs="Courier New"/>
-          <w:sz w:val="20"/>
-          <w:szCs w:val="20"/>
-        </w:rPr>
-        <w:t xml:space="preserve">: </w:t>
-      </w:r>
-      <w:proofErr w:type="spellStart"/>
-      <w:r>
-        <w:rPr>
-          <w:rFonts w:ascii="Courier New" w:eastAsia="Courier New" w:hAnsi="Courier New" w:cs="Courier New"/>
-          <w:sz w:val="20"/>
-          <w:szCs w:val="20"/>
-        </w:rPr>
-        <w:t>evaluate</w:t>
-      </w:r>
-      <w:proofErr w:type="spellEnd"/>
-      <w:r>
-        <w:rPr>
-          <w:rFonts w:ascii="Courier New" w:eastAsia="Courier New" w:hAnsi="Courier New" w:cs="Courier New"/>
-          <w:sz w:val="20"/>
-          <w:szCs w:val="20"/>
-        </w:rPr>
-        <w:t xml:space="preserve"> </w:t>
-      </w:r>
-      <w:proofErr w:type="spellStart"/>
-      <w:r>
-        <w:rPr>
-          <w:rFonts w:ascii="Courier New" w:eastAsia="Courier New" w:hAnsi="Courier New" w:cs="Courier New"/>
-          <w:sz w:val="20"/>
-          <w:szCs w:val="20"/>
-        </w:rPr>
-        <w:t>only</w:t>
-      </w:r>
-      <w:proofErr w:type="spellEnd"/>
-      <w:r>
-        <w:rPr>
-          <w:rFonts w:ascii="Courier New" w:eastAsia="Courier New" w:hAnsi="Courier New" w:cs="Courier New"/>
-          <w:sz w:val="20"/>
-          <w:szCs w:val="20"/>
-        </w:rPr>
-        <w:t xml:space="preserve"> </w:t>
-      </w:r>
-      <w:proofErr w:type="spellStart"/>
-      <w:r>
-        <w:rPr>
-          <w:rFonts w:ascii="Courier New" w:eastAsia="Courier New" w:hAnsi="Courier New" w:cs="Courier New"/>
-          <w:sz w:val="20"/>
-          <w:szCs w:val="20"/>
-        </w:rPr>
-        <w:t>at</w:t>
-      </w:r>
-      <w:proofErr w:type="spellEnd"/>
-      <w:r>
-        <w:rPr>
-          <w:rFonts w:ascii="Courier New" w:eastAsia="Courier New" w:hAnsi="Courier New" w:cs="Courier New"/>
-          <w:sz w:val="20"/>
-          <w:szCs w:val="20"/>
-        </w:rPr>
-        <w:t xml:space="preserve"> </w:t>
-      </w:r>
-      <w:proofErr w:type="spellStart"/>
-      <w:r>
-        <w:rPr>
-          <w:rFonts w:ascii="Courier New" w:eastAsia="Courier New" w:hAnsi="Courier New" w:cs="Courier New"/>
-          <w:sz w:val="20"/>
-          <w:szCs w:val="20"/>
-        </w:rPr>
-        <w:t>the</w:t>
-      </w:r>
-      <w:proofErr w:type="spellEnd"/>
-      <w:r>
-        <w:rPr>
-          <w:rFonts w:ascii="Courier New" w:eastAsia="Courier New" w:hAnsi="Courier New" w:cs="Courier New"/>
-          <w:sz w:val="20"/>
-          <w:szCs w:val="20"/>
-        </w:rPr>
-        <w:t xml:space="preserve"> start </w:t>
-      </w:r>
-      <w:proofErr w:type="spellStart"/>
-      <w:r>
-        <w:rPr>
-          <w:rFonts w:ascii="Courier New" w:eastAsia="Courier New" w:hAnsi="Courier New" w:cs="Courier New"/>
-          <w:sz w:val="20"/>
-          <w:szCs w:val="20"/>
-        </w:rPr>
-        <w:t>of</w:t>
-      </w:r>
-      <w:proofErr w:type="spellEnd"/>
-      <w:r>
-        <w:rPr>
-          <w:rFonts w:ascii="Courier New" w:eastAsia="Courier New" w:hAnsi="Courier New" w:cs="Courier New"/>
-          <w:sz w:val="20"/>
-          <w:szCs w:val="20"/>
-        </w:rPr>
-        <w:t xml:space="preserve"> a new bit </w:t>
-      </w:r>
-      <w:proofErr w:type="spellStart"/>
-      <w:r>
-        <w:rPr>
-          <w:rFonts w:ascii="Courier New" w:eastAsia="Courier New" w:hAnsi="Courier New" w:cs="Courier New"/>
-          <w:sz w:val="20"/>
-          <w:szCs w:val="20"/>
-        </w:rPr>
-        <w:t>cycle</w:t>
-      </w:r>
-      <w:proofErr w:type="spellEnd"/>
-    </w:p>
-    <w:p>
-      <w:pPr>
-        <w:spacing w:after="120" w:line="240" w:lineRule="auto"/>
-        <w:rPr>
-          <w:rFonts w:ascii="Courier New" w:eastAsia="Courier New" w:hAnsi="Courier New" w:cs="Courier New"/>
-          <w:sz w:val="20"/>
-          <w:szCs w:val="20"/>
-        </w:rPr>
-      </w:pPr>
-      <w:r>
-        <w:rPr>
-          <w:rFonts w:ascii="Courier New" w:eastAsia="Courier New" w:hAnsi="Courier New" w:cs="Courier New"/>
-          <w:sz w:val="20"/>
-          <w:szCs w:val="20"/>
-        </w:rPr>
-        <w:t xml:space="preserve">            </w:t>
-      </w:r>
-      <w:proofErr w:type="spellStart"/>
-      <w:r>
-        <w:rPr>
-          <w:rFonts w:ascii="Courier New" w:eastAsia="Courier New" w:hAnsi="Courier New" w:cs="Courier New"/>
-          <w:sz w:val="20"/>
-          <w:szCs w:val="20"/>
-        </w:rPr>
-        <w:t>if</w:t>
-      </w:r>
-      <w:proofErr w:type="spellEnd"/>
-      <w:r>
-        <w:rPr>
-          <w:rFonts w:ascii="Courier New" w:eastAsia="Courier New" w:hAnsi="Courier New" w:cs="Courier New"/>
-          <w:sz w:val="20"/>
-          <w:szCs w:val="20"/>
-        </w:rPr>
-        <w:t xml:space="preserve"> </w:t>
-      </w:r>
-      <w:proofErr w:type="spellStart"/>
-      <w:r>
-        <w:rPr>
-          <w:rFonts w:ascii="Courier New" w:eastAsia="Courier New" w:hAnsi="Courier New" w:cs="Courier New"/>
-          <w:sz w:val="20"/>
-          <w:szCs w:val="20"/>
-        </w:rPr>
-        <w:t>tick_counter</w:t>
-      </w:r>
-      <w:proofErr w:type="spellEnd"/>
-      <w:r>
-        <w:rPr>
-          <w:rFonts w:ascii="Courier New" w:eastAsia="Courier New" w:hAnsi="Courier New" w:cs="Courier New"/>
-          <w:sz w:val="20"/>
-          <w:szCs w:val="20"/>
-        </w:rPr>
-        <w:t xml:space="preserve"> = 0 </w:t>
-      </w:r>
-      <w:proofErr w:type="spellStart"/>
-      <w:r>
-        <w:rPr>
-          <w:rFonts w:ascii="Courier New" w:eastAsia="Courier New" w:hAnsi="Courier New" w:cs="Courier New"/>
-          <w:sz w:val="20"/>
-          <w:szCs w:val="20"/>
-        </w:rPr>
-        <w:t>then</w:t>
-      </w:r>
-      <w:proofErr w:type="spellEnd"/>
-    </w:p>
-    <w:p>
-      <w:pPr>
-        <w:spacing w:after="120" w:line="240" w:lineRule="auto"/>
-        <w:rPr>
-          <w:rFonts w:ascii="Courier New" w:eastAsia="Courier New" w:hAnsi="Courier New" w:cs="Courier New"/>
-          <w:sz w:val="20"/>
-          <w:szCs w:val="20"/>
-        </w:rPr>
-      </w:pPr>
-      <w:r>
-        <w:rPr>
-          <w:rFonts w:ascii="Courier New" w:eastAsia="Courier New" w:hAnsi="Courier New" w:cs="Courier New"/>
-          <w:sz w:val="20"/>
-          <w:szCs w:val="20"/>
-        </w:rPr>
-        <w:t xml:space="preserve">                </w:t>
-      </w:r>
-      <w:proofErr w:type="spellStart"/>
-      <w:r>
-        <w:rPr>
-          <w:rFonts w:ascii="Courier New" w:eastAsia="Courier New" w:hAnsi="Courier New" w:cs="Courier New"/>
-          <w:sz w:val="20"/>
-          <w:szCs w:val="20"/>
-        </w:rPr>
-        <w:t>if</w:t>
-      </w:r>
-      <w:proofErr w:type="spellEnd"/>
-      <w:r>
-        <w:rPr>
-          <w:rFonts w:ascii="Courier New" w:eastAsia="Courier New" w:hAnsi="Courier New" w:cs="Courier New"/>
-          <w:sz w:val="20"/>
-          <w:szCs w:val="20"/>
-        </w:rPr>
-        <w:t xml:space="preserve"> </w:t>
-      </w:r>
-      <w:proofErr w:type="spellStart"/>
-      <w:r>
-        <w:rPr>
-          <w:rFonts w:ascii="Courier New" w:eastAsia="Courier New" w:hAnsi="Courier New" w:cs="Courier New"/>
-          <w:sz w:val="20"/>
-          <w:szCs w:val="20"/>
-        </w:rPr>
-        <w:t>data_in</w:t>
-      </w:r>
-      <w:proofErr w:type="spellEnd"/>
-      <w:r>
-        <w:rPr>
-          <w:rFonts w:ascii="Courier New" w:eastAsia="Courier New" w:hAnsi="Courier New" w:cs="Courier New"/>
-          <w:sz w:val="20"/>
-          <w:szCs w:val="20"/>
-        </w:rPr>
-        <w:t>(</w:t>
-      </w:r>
-      <w:proofErr w:type="spellStart"/>
-      <w:r>
-        <w:rPr>
-          <w:rFonts w:ascii="Courier New" w:eastAsia="Courier New" w:hAnsi="Courier New" w:cs="Courier New"/>
-          <w:sz w:val="20"/>
-          <w:szCs w:val="20"/>
-        </w:rPr>
-        <w:t>bit_ptr</w:t>
-      </w:r>
-      <w:proofErr w:type="spellEnd"/>
-      <w:r>
-        <w:rPr>
-          <w:rFonts w:ascii="Courier New" w:eastAsia="Courier New" w:hAnsi="Courier New" w:cs="Courier New"/>
-          <w:sz w:val="20"/>
-          <w:szCs w:val="20"/>
-        </w:rPr>
-        <w:t xml:space="preserve">) = '1' </w:t>
-      </w:r>
-      <w:proofErr w:type="spellStart"/>
-      <w:r>
-        <w:rPr>
-          <w:rFonts w:ascii="Courier New" w:eastAsia="Courier New" w:hAnsi="Courier New" w:cs="Courier New"/>
-          <w:sz w:val="20"/>
-          <w:szCs w:val="20"/>
-        </w:rPr>
-        <w:t>then</w:t>
-      </w:r>
-      <w:proofErr w:type="spellEnd"/>
-    </w:p>
-    <w:p>
-      <w:pPr>
-        <w:spacing w:after="120" w:line="240" w:lineRule="auto"/>
-        <w:rPr>
-          <w:rFonts w:ascii="Courier New" w:eastAsia="Courier New" w:hAnsi="Courier New" w:cs="Courier New"/>
-          <w:sz w:val="20"/>
-          <w:szCs w:val="20"/>
-        </w:rPr>
-      </w:pPr>
-      <w:r>
-        <w:rPr>
-          <w:rFonts w:ascii="Courier New" w:eastAsia="Courier New" w:hAnsi="Courier New" w:cs="Courier New"/>
-          <w:sz w:val="20"/>
-          <w:szCs w:val="20"/>
-        </w:rPr>
-        <w:t xml:space="preserve">                    -- 1 </w:t>
-      </w:r>
-      <w:proofErr w:type="spellStart"/>
-      <w:r>
-        <w:rPr>
-          <w:rFonts w:ascii="Courier New" w:eastAsia="Courier New" w:hAnsi="Courier New" w:cs="Courier New"/>
-          <w:sz w:val="20"/>
-          <w:szCs w:val="20"/>
-        </w:rPr>
-        <w:t>means</w:t>
-      </w:r>
-      <w:proofErr w:type="spellEnd"/>
-      <w:r>
-        <w:rPr>
-          <w:rFonts w:ascii="Courier New" w:eastAsia="Courier New" w:hAnsi="Courier New" w:cs="Courier New"/>
-          <w:sz w:val="20"/>
-          <w:szCs w:val="20"/>
-        </w:rPr>
-        <w:t xml:space="preserve"> toggle the line</w:t>
-      </w:r>
-    </w:p>
-    <w:p>
-      <w:pPr>
-        <w:spacing w:after="120" w:line="240" w:lineRule="auto"/>
-        <w:rPr>
-          <w:rFonts w:ascii="Courier New" w:eastAsia="Courier New" w:hAnsi="Courier New" w:cs="Courier New"/>
-          <w:sz w:val="20"/>
-          <w:szCs w:val="20"/>
-        </w:rPr>
-      </w:pPr>
-      <w:r>
-        <w:rPr>
-          <w:rFonts w:ascii="Courier New" w:eastAsia="Courier New" w:hAnsi="Courier New" w:cs="Courier New"/>
-          <w:sz w:val="20"/>
-          <w:szCs w:val="20"/>
-        </w:rPr>
-        <w:t xml:space="preserve">                    </w:t>
-      </w:r>
-      <w:proofErr w:type="spellStart"/>
-      <w:r>
-        <w:rPr>
-          <w:rFonts w:ascii="Courier New" w:eastAsia="Courier New" w:hAnsi="Courier New" w:cs="Courier New"/>
-          <w:sz w:val="20"/>
-          <w:szCs w:val="20"/>
-        </w:rPr>
-        <w:t>current_lvl</w:t>
-      </w:r>
-      <w:proofErr w:type="spellEnd"/>
-      <w:r>
-        <w:rPr>
-          <w:rFonts w:ascii="Courier New" w:eastAsia="Courier New" w:hAnsi="Courier New" w:cs="Courier New"/>
-          <w:sz w:val="20"/>
-          <w:szCs w:val="20"/>
-        </w:rPr>
-        <w:t xml:space="preserve"> &lt;= not </w:t>
-      </w:r>
-      <w:proofErr w:type="spellStart"/>
-      <w:r>
-        <w:rPr>
-          <w:rFonts w:ascii="Courier New" w:eastAsia="Courier New" w:hAnsi="Courier New" w:cs="Courier New"/>
-          <w:sz w:val="20"/>
-          <w:szCs w:val="20"/>
-        </w:rPr>
-        <w:t>current_lvl</w:t>
-      </w:r>
-      <w:proofErr w:type="spellEnd"/>
-      <w:r>
-        <w:rPr>
-          <w:rFonts w:ascii="Courier New" w:eastAsia="Courier New" w:hAnsi="Courier New" w:cs="Courier New"/>
-          <w:sz w:val="20"/>
-          <w:szCs w:val="20"/>
-        </w:rPr>
-        <w:t>;</w:t>
-      </w:r>
-    </w:p>
-    <w:p>
-      <w:pPr>
-        <w:spacing w:after="120" w:line="240" w:lineRule="auto"/>
-        <w:rPr>
-          <w:rFonts w:ascii="Courier New" w:eastAsia="Courier New" w:hAnsi="Courier New" w:cs="Courier New"/>
-          <w:sz w:val="20"/>
-          <w:szCs w:val="20"/>
-        </w:rPr>
-      </w:pPr>
-      <w:r>
-        <w:rPr>
-          <w:rFonts w:ascii="Courier New" w:eastAsia="Courier New" w:hAnsi="Courier New" w:cs="Courier New"/>
-          <w:sz w:val="20"/>
-          <w:szCs w:val="20"/>
-        </w:rPr>
-        <w:t xml:space="preserve">                    </w:t>
-      </w:r>
-      <w:proofErr w:type="spellStart"/>
-      <w:r>
-        <w:rPr>
-          <w:rFonts w:ascii="Courier New" w:eastAsia="Courier New" w:hAnsi="Courier New" w:cs="Courier New"/>
-          <w:sz w:val="20"/>
-          <w:szCs w:val="20"/>
-        </w:rPr>
-        <w:t>nrz_out</w:t>
-      </w:r>
-      <w:proofErr w:type="spellEnd"/>
-      <w:r>
-        <w:rPr>
-          <w:rFonts w:ascii="Courier New" w:eastAsia="Courier New" w:hAnsi="Courier New" w:cs="Courier New"/>
-          <w:sz w:val="20"/>
-          <w:szCs w:val="20"/>
-        </w:rPr>
-        <w:t xml:space="preserve"> &lt;= </w:t>
-      </w:r>
-      <w:proofErr w:type="spellStart"/>
-      <w:r>
-        <w:rPr>
-          <w:rFonts w:ascii="Courier New" w:eastAsia="Courier New" w:hAnsi="Courier New" w:cs="Courier New"/>
-          <w:sz w:val="20"/>
-          <w:szCs w:val="20"/>
-        </w:rPr>
-        <w:t>not</w:t>
-      </w:r>
-      <w:proofErr w:type="spellEnd"/>
-      <w:r>
-        <w:rPr>
-          <w:rFonts w:ascii="Courier New" w:eastAsia="Courier New" w:hAnsi="Courier New" w:cs="Courier New"/>
-          <w:sz w:val="20"/>
-          <w:szCs w:val="20"/>
-        </w:rPr>
-        <w:t xml:space="preserve"> </w:t>
-      </w:r>
-      <w:proofErr w:type="spellStart"/>
-      <w:r>
-        <w:rPr>
-          <w:rFonts w:ascii="Courier New" w:eastAsia="Courier New" w:hAnsi="Courier New" w:cs="Courier New"/>
-          <w:sz w:val="20"/>
-          <w:szCs w:val="20"/>
-        </w:rPr>
-        <w:t>current_lvl</w:t>
-      </w:r>
-      <w:proofErr w:type="spellEnd"/>
-      <w:r>
-        <w:rPr>
-          <w:rFonts w:ascii="Courier New" w:eastAsia="Courier New" w:hAnsi="Courier New" w:cs="Courier New"/>
-          <w:sz w:val="20"/>
-          <w:szCs w:val="20"/>
-        </w:rPr>
-        <w:t xml:space="preserve">; -- </w:t>
-      </w:r>
-      <w:proofErr w:type="spellStart"/>
-      <w:r>
-        <w:rPr>
-          <w:rFonts w:ascii="Courier New" w:eastAsia="Courier New" w:hAnsi="Courier New" w:cs="Courier New"/>
-          <w:sz w:val="20"/>
-          <w:szCs w:val="20"/>
-        </w:rPr>
-        <w:t>instantly</w:t>
-      </w:r>
-      <w:proofErr w:type="spellEnd"/>
-      <w:r>
-        <w:rPr>
-          <w:rFonts w:ascii="Courier New" w:eastAsia="Courier New" w:hAnsi="Courier New" w:cs="Courier New"/>
-          <w:sz w:val="20"/>
-          <w:szCs w:val="20"/>
-        </w:rPr>
-        <w:t xml:space="preserve"> push to output</w:t>
-      </w:r>
-    </w:p>
-    <w:p>
-      <w:pPr>
-        <w:spacing w:after="120" w:line="240" w:lineRule="auto"/>
-        <w:rPr>
-          <w:rFonts w:ascii="Courier New" w:eastAsia="Courier New" w:hAnsi="Courier New" w:cs="Courier New"/>
-          <w:sz w:val="20"/>
-          <w:szCs w:val="20"/>
-        </w:rPr>
-      </w:pPr>
-      <w:r>
-        <w:rPr>
-          <w:rFonts w:ascii="Courier New" w:eastAsia="Courier New" w:hAnsi="Courier New" w:cs="Courier New"/>
-          <w:sz w:val="20"/>
-          <w:szCs w:val="20"/>
-        </w:rPr>
-        <w:t xml:space="preserve">                </w:t>
-      </w:r>
-      <w:proofErr w:type="spellStart"/>
-      <w:r>
-        <w:rPr>
-          <w:rFonts w:ascii="Courier New" w:eastAsia="Courier New" w:hAnsi="Courier New" w:cs="Courier New"/>
-          <w:sz w:val="20"/>
-          <w:szCs w:val="20"/>
-        </w:rPr>
-        <w:t>else</w:t>
-      </w:r>
-      <w:proofErr w:type="spellEnd"/>
-    </w:p>
-    <w:p>
-      <w:pPr>
-        <w:spacing w:after="120" w:line="240" w:lineRule="auto"/>
-        <w:rPr>
-          <w:rFonts w:ascii="Courier New" w:eastAsia="Courier New" w:hAnsi="Courier New" w:cs="Courier New"/>
-          <w:sz w:val="20"/>
-          <w:szCs w:val="20"/>
-        </w:rPr>
-      </w:pPr>
-      <w:r>
-        <w:rPr>
-          <w:rFonts w:ascii="Courier New" w:eastAsia="Courier New" w:hAnsi="Courier New" w:cs="Courier New"/>
-          <w:sz w:val="20"/>
-          <w:szCs w:val="20"/>
-        </w:rPr>
-        <w:t xml:space="preserve">                    -- 0 </w:t>
-      </w:r>
-      <w:proofErr w:type="spellStart"/>
-      <w:r>
-        <w:rPr>
-          <w:rFonts w:ascii="Courier New" w:eastAsia="Courier New" w:hAnsi="Courier New" w:cs="Courier New"/>
-          <w:sz w:val="20"/>
-          <w:szCs w:val="20"/>
-        </w:rPr>
-        <w:t>means</w:t>
-      </w:r>
-      <w:proofErr w:type="spellEnd"/>
-      <w:r>
-        <w:rPr>
-          <w:rFonts w:ascii="Courier New" w:eastAsia="Courier New" w:hAnsi="Courier New" w:cs="Courier New"/>
-          <w:sz w:val="20"/>
-          <w:szCs w:val="20"/>
-        </w:rPr>
-        <w:t xml:space="preserve"> </w:t>
-      </w:r>
-      <w:proofErr w:type="spellStart"/>
-      <w:r>
-        <w:rPr>
-          <w:rFonts w:ascii="Courier New" w:eastAsia="Courier New" w:hAnsi="Courier New" w:cs="Courier New"/>
-          <w:sz w:val="20"/>
-          <w:szCs w:val="20"/>
-        </w:rPr>
-        <w:t>hold</w:t>
-      </w:r>
-      <w:proofErr w:type="spellEnd"/>
-      <w:r>
-        <w:rPr>
-          <w:rFonts w:ascii="Courier New" w:eastAsia="Courier New" w:hAnsi="Courier New" w:cs="Courier New"/>
-          <w:sz w:val="20"/>
-          <w:szCs w:val="20"/>
-        </w:rPr>
-        <w:t xml:space="preserve"> </w:t>
-      </w:r>
-      <w:proofErr w:type="spellStart"/>
-      <w:r>
-        <w:rPr>
-          <w:rFonts w:ascii="Courier New" w:eastAsia="Courier New" w:hAnsi="Courier New" w:cs="Courier New"/>
-          <w:sz w:val="20"/>
-          <w:szCs w:val="20"/>
-        </w:rPr>
-        <w:t>the</w:t>
-      </w:r>
-      <w:proofErr w:type="spellEnd"/>
-      <w:r>
-        <w:rPr>
-          <w:rFonts w:ascii="Courier New" w:eastAsia="Courier New" w:hAnsi="Courier New" w:cs="Courier New"/>
-          <w:sz w:val="20"/>
-          <w:szCs w:val="20"/>
-        </w:rPr>
-        <w:t xml:space="preserve"> </w:t>
-      </w:r>
-      <w:proofErr w:type="spellStart"/>
-      <w:r>
-        <w:rPr>
-          <w:rFonts w:ascii="Courier New" w:eastAsia="Courier New" w:hAnsi="Courier New" w:cs="Courier New"/>
-          <w:sz w:val="20"/>
-          <w:szCs w:val="20"/>
-        </w:rPr>
-        <w:t>previous</w:t>
-      </w:r>
-      <w:proofErr w:type="spellEnd"/>
-      <w:r>
-        <w:rPr>
-          <w:rFonts w:ascii="Courier New" w:eastAsia="Courier New" w:hAnsi="Courier New" w:cs="Courier New"/>
-          <w:sz w:val="20"/>
-          <w:szCs w:val="20"/>
-        </w:rPr>
-        <w:t xml:space="preserve"> </w:t>
-      </w:r>
-      <w:proofErr w:type="spellStart"/>
-      <w:r>
-        <w:rPr>
-          <w:rFonts w:ascii="Courier New" w:eastAsia="Courier New" w:hAnsi="Courier New" w:cs="Courier New"/>
-          <w:sz w:val="20"/>
-          <w:szCs w:val="20"/>
-        </w:rPr>
-        <w:t>state</w:t>
-      </w:r>
-      <w:proofErr w:type="spellEnd"/>
-    </w:p>
-    <w:p>
-      <w:pPr>
-        <w:spacing w:after="120" w:line="240" w:lineRule="auto"/>
-        <w:rPr>
-          <w:rFonts w:ascii="Courier New" w:eastAsia="Courier New" w:hAnsi="Courier New" w:cs="Courier New"/>
-          <w:sz w:val="20"/>
-          <w:szCs w:val="20"/>
-        </w:rPr>
-      </w:pPr>
-      <w:r>
-        <w:rPr>
-          <w:rFonts w:ascii="Courier New" w:eastAsia="Courier New" w:hAnsi="Courier New" w:cs="Courier New"/>
-          <w:sz w:val="20"/>
-          <w:szCs w:val="20"/>
-        </w:rPr>
-        <w:t xml:space="preserve">                    </w:t>
-      </w:r>
-      <w:proofErr w:type="spellStart"/>
-      <w:r>
-        <w:rPr>
-          <w:rFonts w:ascii="Courier New" w:eastAsia="Courier New" w:hAnsi="Courier New" w:cs="Courier New"/>
-          <w:sz w:val="20"/>
-          <w:szCs w:val="20"/>
-        </w:rPr>
-        <w:t>nrz_out</w:t>
-      </w:r>
-      <w:proofErr w:type="spellEnd"/>
-      <w:r>
-        <w:rPr>
-          <w:rFonts w:ascii="Courier New" w:eastAsia="Courier New" w:hAnsi="Courier New" w:cs="Courier New"/>
-          <w:sz w:val="20"/>
-          <w:szCs w:val="20"/>
-        </w:rPr>
-        <w:t xml:space="preserve"> &lt;= </w:t>
-      </w:r>
-      <w:proofErr w:type="spellStart"/>
-      <w:r>
-        <w:rPr>
-          <w:rFonts w:ascii="Courier New" w:eastAsia="Courier New" w:hAnsi="Courier New" w:cs="Courier New"/>
-          <w:sz w:val="20"/>
-          <w:szCs w:val="20"/>
-        </w:rPr>
-        <w:t>current_lvl</w:t>
-      </w:r>
-      <w:proofErr w:type="spellEnd"/>
-      <w:r>
-        <w:rPr>
-          <w:rFonts w:ascii="Courier New" w:eastAsia="Courier New" w:hAnsi="Courier New" w:cs="Courier New"/>
-          <w:sz w:val="20"/>
-          <w:szCs w:val="20"/>
-        </w:rPr>
-        <w:t>;</w:t>
-      </w:r>
-    </w:p>
-    <w:p>
-      <w:pPr>
-        <w:spacing w:after="120" w:line="240" w:lineRule="auto"/>
-        <w:rPr>
-          <w:rFonts w:ascii="Courier New" w:eastAsia="Courier New" w:hAnsi="Courier New" w:cs="Courier New"/>
-          <w:sz w:val="20"/>
-          <w:szCs w:val="20"/>
-        </w:rPr>
-      </w:pPr>
-      <w:r>
-        <w:rPr>
-          <w:rFonts w:ascii="Courier New" w:eastAsia="Courier New" w:hAnsi="Courier New" w:cs="Courier New"/>
-          <w:sz w:val="20"/>
-          <w:szCs w:val="20"/>
-        </w:rPr>
-        <w:t xml:space="preserve">                </w:t>
-      </w:r>
-      <w:proofErr w:type="spellStart"/>
-      <w:r>
-        <w:rPr>
-          <w:rFonts w:ascii="Courier New" w:eastAsia="Courier New" w:hAnsi="Courier New" w:cs="Courier New"/>
-          <w:sz w:val="20"/>
-          <w:szCs w:val="20"/>
-        </w:rPr>
-        <w:t>end</w:t>
-      </w:r>
-      <w:proofErr w:type="spellEnd"/>
-      <w:r>
-        <w:rPr>
-          <w:rFonts w:ascii="Courier New" w:eastAsia="Courier New" w:hAnsi="Courier New" w:cs="Courier New"/>
-          <w:sz w:val="20"/>
-          <w:szCs w:val="20"/>
-        </w:rPr>
-        <w:t xml:space="preserve"> if;</w:t>
-      </w:r>
-    </w:p>
-    <w:p>
-      <w:pPr>
-        <w:spacing w:after="120" w:line="240" w:lineRule="auto"/>
-        <w:rPr>
-          <w:rFonts w:ascii="Courier New" w:eastAsia="Courier New" w:hAnsi="Courier New" w:cs="Courier New"/>
-          <w:sz w:val="20"/>
-          <w:szCs w:val="20"/>
-        </w:rPr>
-      </w:pPr>
-      <w:r>
-        <w:rPr>
-          <w:rFonts w:ascii="Courier New" w:eastAsia="Courier New" w:hAnsi="Courier New" w:cs="Courier New"/>
-          <w:sz w:val="20"/>
-          <w:szCs w:val="20"/>
-        </w:rPr>
-        <w:t xml:space="preserve">            </w:t>
-      </w:r>
-      <w:proofErr w:type="spellStart"/>
-      <w:r>
-        <w:rPr>
-          <w:rFonts w:ascii="Courier New" w:eastAsia="Courier New" w:hAnsi="Courier New" w:cs="Courier New"/>
-          <w:sz w:val="20"/>
-          <w:szCs w:val="20"/>
-        </w:rPr>
-        <w:t>else</w:t>
-      </w:r>
-      <w:proofErr w:type="spellEnd"/>
-    </w:p>
-    <w:p>
-      <w:pPr>
-        <w:spacing w:after="120" w:line="240" w:lineRule="auto"/>
-        <w:rPr>
-          <w:rFonts w:ascii="Courier New" w:eastAsia="Courier New" w:hAnsi="Courier New" w:cs="Courier New"/>
-          <w:sz w:val="20"/>
-          <w:szCs w:val="20"/>
-        </w:rPr>
-      </w:pPr>
-      <w:r>
-        <w:rPr>
-          <w:rFonts w:ascii="Courier New" w:eastAsia="Courier New" w:hAnsi="Courier New" w:cs="Courier New"/>
-          <w:sz w:val="20"/>
-          <w:szCs w:val="20"/>
-        </w:rPr>
-        <w:t xml:space="preserve">                -- </w:t>
-      </w:r>
-      <w:proofErr w:type="spellStart"/>
-      <w:r>
-        <w:rPr>
-          <w:rFonts w:ascii="Courier New" w:eastAsia="Courier New" w:hAnsi="Courier New" w:cs="Courier New"/>
-          <w:sz w:val="20"/>
-          <w:szCs w:val="20"/>
-        </w:rPr>
-        <w:t>just</w:t>
-      </w:r>
-      <w:proofErr w:type="spellEnd"/>
-      <w:r>
-        <w:rPr>
-          <w:rFonts w:ascii="Courier New" w:eastAsia="Courier New" w:hAnsi="Courier New" w:cs="Courier New"/>
-          <w:sz w:val="20"/>
-          <w:szCs w:val="20"/>
-        </w:rPr>
-        <w:t xml:space="preserve"> </w:t>
-      </w:r>
-      <w:proofErr w:type="spellStart"/>
-      <w:r>
-        <w:rPr>
-          <w:rFonts w:ascii="Courier New" w:eastAsia="Courier New" w:hAnsi="Courier New" w:cs="Courier New"/>
-          <w:sz w:val="20"/>
-          <w:szCs w:val="20"/>
-        </w:rPr>
-        <w:t>hold</w:t>
-      </w:r>
-      <w:proofErr w:type="spellEnd"/>
-      <w:r>
-        <w:rPr>
-          <w:rFonts w:ascii="Courier New" w:eastAsia="Courier New" w:hAnsi="Courier New" w:cs="Courier New"/>
-          <w:sz w:val="20"/>
-          <w:szCs w:val="20"/>
-        </w:rPr>
-        <w:t xml:space="preserve"> </w:t>
-      </w:r>
-      <w:proofErr w:type="spellStart"/>
-      <w:r>
-        <w:rPr>
-          <w:rFonts w:ascii="Courier New" w:eastAsia="Courier New" w:hAnsi="Courier New" w:cs="Courier New"/>
-          <w:sz w:val="20"/>
-          <w:szCs w:val="20"/>
-        </w:rPr>
-        <w:t>the</w:t>
-      </w:r>
-      <w:proofErr w:type="spellEnd"/>
-      <w:r>
-        <w:rPr>
-          <w:rFonts w:ascii="Courier New" w:eastAsia="Courier New" w:hAnsi="Courier New" w:cs="Courier New"/>
-          <w:sz w:val="20"/>
-          <w:szCs w:val="20"/>
-        </w:rPr>
-        <w:t xml:space="preserve"> </w:t>
-      </w:r>
-      <w:proofErr w:type="spellStart"/>
-      <w:r>
-        <w:rPr>
-          <w:rFonts w:ascii="Courier New" w:eastAsia="Courier New" w:hAnsi="Courier New" w:cs="Courier New"/>
-          <w:sz w:val="20"/>
-          <w:szCs w:val="20"/>
-        </w:rPr>
-        <w:t>line</w:t>
-      </w:r>
-      <w:proofErr w:type="spellEnd"/>
-      <w:r>
-        <w:rPr>
-          <w:rFonts w:ascii="Courier New" w:eastAsia="Courier New" w:hAnsi="Courier New" w:cs="Courier New"/>
-          <w:sz w:val="20"/>
-          <w:szCs w:val="20"/>
-        </w:rPr>
-        <w:t xml:space="preserve"> </w:t>
-      </w:r>
-      <w:proofErr w:type="spellStart"/>
-      <w:r>
-        <w:rPr>
-          <w:rFonts w:ascii="Courier New" w:eastAsia="Courier New" w:hAnsi="Courier New" w:cs="Courier New"/>
-          <w:sz w:val="20"/>
-          <w:szCs w:val="20"/>
-        </w:rPr>
-        <w:t>steady</w:t>
-      </w:r>
-      <w:proofErr w:type="spellEnd"/>
-      <w:r>
-        <w:rPr>
-          <w:rFonts w:ascii="Courier New" w:eastAsia="Courier New" w:hAnsi="Courier New" w:cs="Courier New"/>
-          <w:sz w:val="20"/>
-          <w:szCs w:val="20"/>
-        </w:rPr>
-        <w:t xml:space="preserve"> for </w:t>
-      </w:r>
-      <w:proofErr w:type="spellStart"/>
-      <w:r>
-        <w:rPr>
-          <w:rFonts w:ascii="Courier New" w:eastAsia="Courier New" w:hAnsi="Courier New" w:cs="Courier New"/>
-          <w:sz w:val="20"/>
-          <w:szCs w:val="20"/>
-        </w:rPr>
-        <w:t>the</w:t>
-      </w:r>
-      <w:proofErr w:type="spellEnd"/>
-      <w:r>
-        <w:rPr>
-          <w:rFonts w:ascii="Courier New" w:eastAsia="Courier New" w:hAnsi="Courier New" w:cs="Courier New"/>
-          <w:sz w:val="20"/>
-          <w:szCs w:val="20"/>
-        </w:rPr>
-        <w:t xml:space="preserve"> </w:t>
-      </w:r>
-      <w:proofErr w:type="spellStart"/>
-      <w:r>
-        <w:rPr>
-          <w:rFonts w:ascii="Courier New" w:eastAsia="Courier New" w:hAnsi="Courier New" w:cs="Courier New"/>
-          <w:sz w:val="20"/>
-          <w:szCs w:val="20"/>
-        </w:rPr>
-        <w:t>rest</w:t>
-      </w:r>
-      <w:proofErr w:type="spellEnd"/>
-      <w:r>
-        <w:rPr>
-          <w:rFonts w:ascii="Courier New" w:eastAsia="Courier New" w:hAnsi="Courier New" w:cs="Courier New"/>
-          <w:sz w:val="20"/>
-          <w:szCs w:val="20"/>
-        </w:rPr>
-        <w:t xml:space="preserve"> </w:t>
-      </w:r>
-      <w:proofErr w:type="spellStart"/>
-      <w:r>
-        <w:rPr>
-          <w:rFonts w:ascii="Courier New" w:eastAsia="Courier New" w:hAnsi="Courier New" w:cs="Courier New"/>
-          <w:sz w:val="20"/>
-          <w:szCs w:val="20"/>
-        </w:rPr>
-        <w:t>of</w:t>
-      </w:r>
-      <w:proofErr w:type="spellEnd"/>
-      <w:r>
-        <w:rPr>
-          <w:rFonts w:ascii="Courier New" w:eastAsia="Courier New" w:hAnsi="Courier New" w:cs="Courier New"/>
-          <w:sz w:val="20"/>
-          <w:szCs w:val="20"/>
-        </w:rPr>
-        <w:t xml:space="preserve"> the bit </w:t>
-      </w:r>
-      <w:proofErr w:type="spellStart"/>
-      <w:r>
-        <w:rPr>
-          <w:rFonts w:ascii="Courier New" w:eastAsia="Courier New" w:hAnsi="Courier New" w:cs="Courier New"/>
-          <w:sz w:val="20"/>
-          <w:szCs w:val="20"/>
-        </w:rPr>
-        <w:t>duration</w:t>
-      </w:r>
-      <w:proofErr w:type="spellEnd"/>
-    </w:p>
-    <w:p>
-      <w:pPr>
-        <w:spacing w:after="120" w:line="240" w:lineRule="auto"/>
-        <w:rPr>
-          <w:rFonts w:ascii="Courier New" w:eastAsia="Courier New" w:hAnsi="Courier New" w:cs="Courier New"/>
-          <w:sz w:val="20"/>
-          <w:szCs w:val="20"/>
-        </w:rPr>
-      </w:pPr>
-      <w:r>
-        <w:rPr>
-          <w:rFonts w:ascii="Courier New" w:eastAsia="Courier New" w:hAnsi="Courier New" w:cs="Courier New"/>
-          <w:sz w:val="20"/>
-          <w:szCs w:val="20"/>
-        </w:rPr>
-        <w:t xml:space="preserve">                </w:t>
-      </w:r>
-      <w:proofErr w:type="spellStart"/>
-      <w:r>
-        <w:rPr>
-          <w:rFonts w:ascii="Courier New" w:eastAsia="Courier New" w:hAnsi="Courier New" w:cs="Courier New"/>
-          <w:sz w:val="20"/>
-          <w:szCs w:val="20"/>
-        </w:rPr>
-        <w:t>nrz_out</w:t>
-      </w:r>
-      <w:proofErr w:type="spellEnd"/>
-      <w:r>
-        <w:rPr>
-          <w:rFonts w:ascii="Courier New" w:eastAsia="Courier New" w:hAnsi="Courier New" w:cs="Courier New"/>
-          <w:sz w:val="20"/>
-          <w:szCs w:val="20"/>
-        </w:rPr>
-        <w:t xml:space="preserve"> &lt;= </w:t>
-      </w:r>
-      <w:proofErr w:type="spellStart"/>
-      <w:r>
-        <w:rPr>
-          <w:rFonts w:ascii="Courier New" w:eastAsia="Courier New" w:hAnsi="Courier New" w:cs="Courier New"/>
-          <w:sz w:val="20"/>
-          <w:szCs w:val="20"/>
-        </w:rPr>
-        <w:t>current_lvl</w:t>
-      </w:r>
-      <w:proofErr w:type="spellEnd"/>
-      <w:r>
-        <w:rPr>
-          <w:rFonts w:ascii="Courier New" w:eastAsia="Courier New" w:hAnsi="Courier New" w:cs="Courier New"/>
-          <w:sz w:val="20"/>
-          <w:szCs w:val="20"/>
-        </w:rPr>
-        <w:t>;</w:t>
-      </w:r>
-    </w:p>
-    <w:p>
-      <w:pPr>
-        <w:spacing w:after="120" w:line="240" w:lineRule="auto"/>
-        <w:rPr>
-          <w:rFonts w:ascii="Courier New" w:eastAsia="Courier New" w:hAnsi="Courier New" w:cs="Courier New"/>
-          <w:sz w:val="20"/>
-          <w:szCs w:val="20"/>
-        </w:rPr>
-      </w:pPr>
-      <w:r>
-        <w:rPr>
-          <w:rFonts w:ascii="Courier New" w:eastAsia="Courier New" w:hAnsi="Courier New" w:cs="Courier New"/>
-          <w:sz w:val="20"/>
-          <w:szCs w:val="20"/>
-        </w:rPr>
-        <w:t xml:space="preserve">            </w:t>
-      </w:r>
-      <w:proofErr w:type="spellStart"/>
-      <w:r>
-        <w:rPr>
-          <w:rFonts w:ascii="Courier New" w:eastAsia="Courier New" w:hAnsi="Courier New" w:cs="Courier New"/>
-          <w:sz w:val="20"/>
-          <w:szCs w:val="20"/>
-        </w:rPr>
-        <w:t>end</w:t>
-      </w:r>
-      <w:proofErr w:type="spellEnd"/>
-      <w:r>
-        <w:rPr>
-          <w:rFonts w:ascii="Courier New" w:eastAsia="Courier New" w:hAnsi="Courier New" w:cs="Courier New"/>
-          <w:sz w:val="20"/>
-          <w:szCs w:val="20"/>
-        </w:rPr>
-        <w:t xml:space="preserve"> if;</w:t>
-      </w:r>
-    </w:p>
-    <w:p>
-      <w:pPr>
-        <w:spacing w:after="120" w:line="240" w:lineRule="auto"/>
-        <w:rPr>
-          <w:rFonts w:ascii="Courier New" w:eastAsia="Courier New" w:hAnsi="Courier New" w:cs="Courier New"/>
-          <w:sz w:val="20"/>
-          <w:szCs w:val="20"/>
-        </w:rPr>
-      </w:pPr>
-    </w:p>
-    <w:p>
-      <w:pPr>
-        <w:spacing w:after="120" w:line="240" w:lineRule="auto"/>
-        <w:rPr>
-          <w:rFonts w:ascii="Courier New" w:eastAsia="Courier New" w:hAnsi="Courier New" w:cs="Courier New"/>
-          <w:sz w:val="20"/>
-          <w:szCs w:val="20"/>
-        </w:rPr>
-      </w:pPr>
-      <w:r>
-        <w:rPr>
-          <w:rFonts w:ascii="Courier New" w:eastAsia="Courier New" w:hAnsi="Courier New" w:cs="Courier New"/>
-          <w:sz w:val="20"/>
-          <w:szCs w:val="20"/>
-        </w:rPr>
-        <w:t xml:space="preserve">            -- </w:t>
-      </w:r>
-      <w:proofErr w:type="spellStart"/>
-      <w:r>
-        <w:rPr>
-          <w:rFonts w:ascii="Courier New" w:eastAsia="Courier New" w:hAnsi="Courier New" w:cs="Courier New"/>
-          <w:sz w:val="20"/>
-          <w:szCs w:val="20"/>
-        </w:rPr>
-        <w:t>handle</w:t>
-      </w:r>
-      <w:proofErr w:type="spellEnd"/>
-      <w:r>
-        <w:rPr>
-          <w:rFonts w:ascii="Courier New" w:eastAsia="Courier New" w:hAnsi="Courier New" w:cs="Courier New"/>
-          <w:sz w:val="20"/>
-          <w:szCs w:val="20"/>
-        </w:rPr>
-        <w:t xml:space="preserve"> </w:t>
-      </w:r>
-      <w:proofErr w:type="spellStart"/>
-      <w:r>
-        <w:rPr>
-          <w:rFonts w:ascii="Courier New" w:eastAsia="Courier New" w:hAnsi="Courier New" w:cs="Courier New"/>
-          <w:sz w:val="20"/>
-          <w:szCs w:val="20"/>
-        </w:rPr>
-        <w:t>the</w:t>
-      </w:r>
-      <w:proofErr w:type="spellEnd"/>
-      <w:r>
-        <w:rPr>
-          <w:rFonts w:ascii="Courier New" w:eastAsia="Courier New" w:hAnsi="Courier New" w:cs="Courier New"/>
-          <w:sz w:val="20"/>
-          <w:szCs w:val="20"/>
-        </w:rPr>
-        <w:t xml:space="preserve"> timing </w:t>
-      </w:r>
-      <w:proofErr w:type="spellStart"/>
-      <w:r>
-        <w:rPr>
-          <w:rFonts w:ascii="Courier New" w:eastAsia="Courier New" w:hAnsi="Courier New" w:cs="Courier New"/>
-          <w:sz w:val="20"/>
-          <w:szCs w:val="20"/>
-        </w:rPr>
-        <w:t>and</w:t>
-      </w:r>
-      <w:proofErr w:type="spellEnd"/>
-      <w:r>
-        <w:rPr>
-          <w:rFonts w:ascii="Courier New" w:eastAsia="Courier New" w:hAnsi="Courier New" w:cs="Courier New"/>
-          <w:sz w:val="20"/>
-          <w:szCs w:val="20"/>
-        </w:rPr>
-        <w:t xml:space="preserve"> pointer (</w:t>
-      </w:r>
-      <w:proofErr w:type="spellStart"/>
-      <w:r>
-        <w:rPr>
-          <w:rFonts w:ascii="Courier New" w:eastAsia="Courier New" w:hAnsi="Courier New" w:cs="Courier New"/>
-          <w:sz w:val="20"/>
-          <w:szCs w:val="20"/>
-        </w:rPr>
-        <w:t>same</w:t>
-      </w:r>
-      <w:proofErr w:type="spellEnd"/>
-      <w:r>
-        <w:rPr>
-          <w:rFonts w:ascii="Courier New" w:eastAsia="Courier New" w:hAnsi="Courier New" w:cs="Courier New"/>
-          <w:sz w:val="20"/>
-          <w:szCs w:val="20"/>
-        </w:rPr>
-        <w:t xml:space="preserve"> as </w:t>
-      </w:r>
-      <w:proofErr w:type="spellStart"/>
-      <w:r>
-        <w:rPr>
-          <w:rFonts w:ascii="Courier New" w:eastAsia="Courier New" w:hAnsi="Courier New" w:cs="Courier New"/>
-          <w:sz w:val="20"/>
-          <w:szCs w:val="20"/>
-        </w:rPr>
-        <w:t>nrz</w:t>
-      </w:r>
-      <w:proofErr w:type="spellEnd"/>
-      <w:r>
-        <w:rPr>
-          <w:rFonts w:ascii="Courier New" w:eastAsia="Courier New" w:hAnsi="Courier New" w:cs="Courier New"/>
-          <w:sz w:val="20"/>
-          <w:szCs w:val="20"/>
-        </w:rPr>
-        <w:t>-l)</w:t>
-      </w:r>
-    </w:p>
-    <w:p>
-      <w:pPr>
-        <w:spacing w:after="120" w:line="240" w:lineRule="auto"/>
-        <w:rPr>
-          <w:rFonts w:ascii="Courier New" w:eastAsia="Courier New" w:hAnsi="Courier New" w:cs="Courier New"/>
-          <w:sz w:val="20"/>
-          <w:szCs w:val="20"/>
-        </w:rPr>
-      </w:pPr>
-      <w:r>
-        <w:rPr>
-          <w:rFonts w:ascii="Courier New" w:eastAsia="Courier New" w:hAnsi="Courier New" w:cs="Courier New"/>
-          <w:sz w:val="20"/>
-          <w:szCs w:val="20"/>
-        </w:rPr>
-        <w:t xml:space="preserve">            </w:t>
-      </w:r>
-      <w:proofErr w:type="spellStart"/>
-      <w:r>
-        <w:rPr>
-          <w:rFonts w:ascii="Courier New" w:eastAsia="Courier New" w:hAnsi="Courier New" w:cs="Courier New"/>
-          <w:sz w:val="20"/>
-          <w:szCs w:val="20"/>
-        </w:rPr>
-        <w:t>if</w:t>
-      </w:r>
-      <w:proofErr w:type="spellEnd"/>
-      <w:r>
-        <w:rPr>
-          <w:rFonts w:ascii="Courier New" w:eastAsia="Courier New" w:hAnsi="Courier New" w:cs="Courier New"/>
-          <w:sz w:val="20"/>
-          <w:szCs w:val="20"/>
-        </w:rPr>
-        <w:t xml:space="preserve"> </w:t>
-      </w:r>
-      <w:proofErr w:type="spellStart"/>
-      <w:r>
-        <w:rPr>
-          <w:rFonts w:ascii="Courier New" w:eastAsia="Courier New" w:hAnsi="Courier New" w:cs="Courier New"/>
-          <w:sz w:val="20"/>
-          <w:szCs w:val="20"/>
-        </w:rPr>
-        <w:t>tick_counter</w:t>
-      </w:r>
-      <w:proofErr w:type="spellEnd"/>
-      <w:r>
-        <w:rPr>
-          <w:rFonts w:ascii="Courier New" w:eastAsia="Courier New" w:hAnsi="Courier New" w:cs="Courier New"/>
-          <w:sz w:val="20"/>
-          <w:szCs w:val="20"/>
-        </w:rPr>
-        <w:t xml:space="preserve"> &lt; TICKS_PER_BIT - 1 </w:t>
-      </w:r>
-      <w:proofErr w:type="spellStart"/>
-      <w:r>
-        <w:rPr>
-          <w:rFonts w:ascii="Courier New" w:eastAsia="Courier New" w:hAnsi="Courier New" w:cs="Courier New"/>
-          <w:sz w:val="20"/>
-          <w:szCs w:val="20"/>
-        </w:rPr>
-        <w:t>then</w:t>
-      </w:r>
-      <w:proofErr w:type="spellEnd"/>
-    </w:p>
-    <w:p>
-      <w:pPr>
-        <w:spacing w:after="120" w:line="240" w:lineRule="auto"/>
-        <w:rPr>
-          <w:rFonts w:ascii="Courier New" w:eastAsia="Courier New" w:hAnsi="Courier New" w:cs="Courier New"/>
-          <w:sz w:val="20"/>
-          <w:szCs w:val="20"/>
-        </w:rPr>
-      </w:pPr>
-      <w:r>
-        <w:rPr>
-          <w:rFonts w:ascii="Courier New" w:eastAsia="Courier New" w:hAnsi="Courier New" w:cs="Courier New"/>
-          <w:sz w:val="20"/>
-          <w:szCs w:val="20"/>
-        </w:rPr>
-        <w:t xml:space="preserve">                -- </w:t>
-      </w:r>
-      <w:proofErr w:type="spellStart"/>
-      <w:r>
-        <w:rPr>
-          <w:rFonts w:ascii="Courier New" w:eastAsia="Courier New" w:hAnsi="Courier New" w:cs="Courier New"/>
-          <w:sz w:val="20"/>
-          <w:szCs w:val="20"/>
-        </w:rPr>
-        <w:t>increment</w:t>
-      </w:r>
-      <w:proofErr w:type="spellEnd"/>
-      <w:r>
-        <w:rPr>
-          <w:rFonts w:ascii="Courier New" w:eastAsia="Courier New" w:hAnsi="Courier New" w:cs="Courier New"/>
-          <w:sz w:val="20"/>
-          <w:szCs w:val="20"/>
-        </w:rPr>
-        <w:t xml:space="preserve"> counter</w:t>
-      </w:r>
-    </w:p>
-    <w:p>
-      <w:pPr>
-        <w:spacing w:after="120" w:line="240" w:lineRule="auto"/>
-        <w:rPr>
-          <w:rFonts w:ascii="Courier New" w:eastAsia="Courier New" w:hAnsi="Courier New" w:cs="Courier New"/>
-          <w:sz w:val="20"/>
-          <w:szCs w:val="20"/>
-        </w:rPr>
-      </w:pPr>
-      <w:r>
-        <w:rPr>
-          <w:rFonts w:ascii="Courier New" w:eastAsia="Courier New" w:hAnsi="Courier New" w:cs="Courier New"/>
-          <w:sz w:val="20"/>
-          <w:szCs w:val="20"/>
-        </w:rPr>
-        <w:t xml:space="preserve">                </w:t>
-      </w:r>
-      <w:proofErr w:type="spellStart"/>
-      <w:r>
-        <w:rPr>
-          <w:rFonts w:ascii="Courier New" w:eastAsia="Courier New" w:hAnsi="Courier New" w:cs="Courier New"/>
-          <w:sz w:val="20"/>
-          <w:szCs w:val="20"/>
-        </w:rPr>
-        <w:t>tick_counter</w:t>
-      </w:r>
-      <w:proofErr w:type="spellEnd"/>
-      <w:r>
-        <w:rPr>
-          <w:rFonts w:ascii="Courier New" w:eastAsia="Courier New" w:hAnsi="Courier New" w:cs="Courier New"/>
-          <w:sz w:val="20"/>
-          <w:szCs w:val="20"/>
-        </w:rPr>
-        <w:t xml:space="preserve"> &lt;= </w:t>
-      </w:r>
-      <w:proofErr w:type="spellStart"/>
-      <w:r>
-        <w:rPr>
-          <w:rFonts w:ascii="Courier New" w:eastAsia="Courier New" w:hAnsi="Courier New" w:cs="Courier New"/>
-          <w:sz w:val="20"/>
-          <w:szCs w:val="20"/>
-        </w:rPr>
-        <w:t>tick_counter</w:t>
-      </w:r>
-      <w:proofErr w:type="spellEnd"/>
-      <w:r>
-        <w:rPr>
-          <w:rFonts w:ascii="Courier New" w:eastAsia="Courier New" w:hAnsi="Courier New" w:cs="Courier New"/>
-          <w:sz w:val="20"/>
-          <w:szCs w:val="20"/>
-        </w:rPr>
-        <w:t xml:space="preserve"> + 1;</w:t>
-      </w:r>
-    </w:p>
-    <w:p>
-      <w:pPr>
-        <w:spacing w:after="120" w:line="240" w:lineRule="auto"/>
-        <w:rPr>
-          <w:rFonts w:ascii="Courier New" w:eastAsia="Courier New" w:hAnsi="Courier New" w:cs="Courier New"/>
-          <w:sz w:val="20"/>
-          <w:szCs w:val="20"/>
-        </w:rPr>
-      </w:pPr>
-      <w:r>
-        <w:rPr>
-          <w:rFonts w:ascii="Courier New" w:eastAsia="Courier New" w:hAnsi="Courier New" w:cs="Courier New"/>
-          <w:sz w:val="20"/>
-          <w:szCs w:val="20"/>
-        </w:rPr>
-        <w:t xml:space="preserve">            </w:t>
-      </w:r>
-      <w:proofErr w:type="spellStart"/>
-      <w:r>
-        <w:rPr>
-          <w:rFonts w:ascii="Courier New" w:eastAsia="Courier New" w:hAnsi="Courier New" w:cs="Courier New"/>
-          <w:sz w:val="20"/>
-          <w:szCs w:val="20"/>
-        </w:rPr>
-        <w:t>else</w:t>
-      </w:r>
-      <w:proofErr w:type="spellEnd"/>
-    </w:p>
-    <w:p>
-      <w:pPr>
-        <w:spacing w:after="120" w:line="240" w:lineRule="auto"/>
-        <w:rPr>
-          <w:rFonts w:ascii="Courier New" w:eastAsia="Courier New" w:hAnsi="Courier New" w:cs="Courier New"/>
-          <w:sz w:val="20"/>
-          <w:szCs w:val="20"/>
-        </w:rPr>
-      </w:pPr>
-      <w:r>
-        <w:rPr>
-          <w:rFonts w:ascii="Courier New" w:eastAsia="Courier New" w:hAnsi="Courier New" w:cs="Courier New"/>
-          <w:sz w:val="20"/>
-          <w:szCs w:val="20"/>
-        </w:rPr>
-        <w:t xml:space="preserve">                -- reset </w:t>
-      </w:r>
-      <w:proofErr w:type="spellStart"/>
-      <w:r>
-        <w:rPr>
-          <w:rFonts w:ascii="Courier New" w:eastAsia="Courier New" w:hAnsi="Courier New" w:cs="Courier New"/>
-          <w:sz w:val="20"/>
-          <w:szCs w:val="20"/>
-        </w:rPr>
-        <w:t>the</w:t>
-      </w:r>
-      <w:proofErr w:type="spellEnd"/>
-      <w:r>
-        <w:rPr>
-          <w:rFonts w:ascii="Courier New" w:eastAsia="Courier New" w:hAnsi="Courier New" w:cs="Courier New"/>
-          <w:sz w:val="20"/>
-          <w:szCs w:val="20"/>
-        </w:rPr>
-        <w:t xml:space="preserve"> counter</w:t>
-      </w:r>
-    </w:p>
-    <w:p>
-      <w:pPr>
-        <w:spacing w:after="120" w:line="240" w:lineRule="auto"/>
-        <w:rPr>
-          <w:rFonts w:ascii="Courier New" w:eastAsia="Courier New" w:hAnsi="Courier New" w:cs="Courier New"/>
-          <w:sz w:val="20"/>
-          <w:szCs w:val="20"/>
-        </w:rPr>
-      </w:pPr>
-      <w:r>
-        <w:rPr>
-          <w:rFonts w:ascii="Courier New" w:eastAsia="Courier New" w:hAnsi="Courier New" w:cs="Courier New"/>
-          <w:sz w:val="20"/>
-          <w:szCs w:val="20"/>
-        </w:rPr>
-        <w:t xml:space="preserve">                </w:t>
-      </w:r>
-      <w:proofErr w:type="spellStart"/>
-      <w:r>
-        <w:rPr>
-          <w:rFonts w:ascii="Courier New" w:eastAsia="Courier New" w:hAnsi="Courier New" w:cs="Courier New"/>
-          <w:sz w:val="20"/>
-          <w:szCs w:val="20"/>
-        </w:rPr>
-        <w:t>tick_counter</w:t>
-      </w:r>
-      <w:proofErr w:type="spellEnd"/>
-      <w:r>
-        <w:rPr>
-          <w:rFonts w:ascii="Courier New" w:eastAsia="Courier New" w:hAnsi="Courier New" w:cs="Courier New"/>
-          <w:sz w:val="20"/>
-          <w:szCs w:val="20"/>
-        </w:rPr>
-        <w:t xml:space="preserve"> &lt;= 0;</w:t>
-      </w:r>
-    </w:p>
-    <w:p>
-      <w:pPr>
-        <w:spacing w:after="120" w:line="240" w:lineRule="auto"/>
-        <w:rPr>
-          <w:rFonts w:ascii="Courier New" w:eastAsia="Courier New" w:hAnsi="Courier New" w:cs="Courier New"/>
-          <w:sz w:val="20"/>
-          <w:szCs w:val="20"/>
-        </w:rPr>
-      </w:pPr>
-      <w:r>
-        <w:rPr>
-          <w:rFonts w:ascii="Courier New" w:eastAsia="Courier New" w:hAnsi="Courier New" w:cs="Courier New"/>
-          <w:sz w:val="20"/>
-          <w:szCs w:val="20"/>
-        </w:rPr>
-        <w:t xml:space="preserve">                </w:t>
-      </w:r>
-    </w:p>
-    <w:p>
-      <w:pPr>
-        <w:spacing w:after="120" w:line="240" w:lineRule="auto"/>
-        <w:rPr>
-          <w:rFonts w:ascii="Courier New" w:eastAsia="Courier New" w:hAnsi="Courier New" w:cs="Courier New"/>
-          <w:sz w:val="20"/>
-          <w:szCs w:val="20"/>
-        </w:rPr>
-      </w:pPr>
-      <w:r>
-        <w:rPr>
-          <w:rFonts w:ascii="Courier New" w:eastAsia="Courier New" w:hAnsi="Courier New" w:cs="Courier New"/>
-          <w:sz w:val="20"/>
-          <w:szCs w:val="20"/>
-        </w:rPr>
-        <w:t xml:space="preserve">                </w:t>
-      </w:r>
-      <w:proofErr w:type="spellStart"/>
-      <w:r>
-        <w:rPr>
-          <w:rFonts w:ascii="Courier New" w:eastAsia="Courier New" w:hAnsi="Courier New" w:cs="Courier New"/>
-          <w:sz w:val="20"/>
-          <w:szCs w:val="20"/>
-        </w:rPr>
-        <w:t>if</w:t>
-      </w:r>
-      <w:proofErr w:type="spellEnd"/>
-      <w:r>
-        <w:rPr>
-          <w:rFonts w:ascii="Courier New" w:eastAsia="Courier New" w:hAnsi="Courier New" w:cs="Courier New"/>
-          <w:sz w:val="20"/>
-          <w:szCs w:val="20"/>
-        </w:rPr>
-        <w:t xml:space="preserve"> </w:t>
-      </w:r>
-      <w:proofErr w:type="spellStart"/>
-      <w:r>
-        <w:rPr>
-          <w:rFonts w:ascii="Courier New" w:eastAsia="Courier New" w:hAnsi="Courier New" w:cs="Courier New"/>
-          <w:sz w:val="20"/>
-          <w:szCs w:val="20"/>
-        </w:rPr>
-        <w:t>bit_ptr</w:t>
-      </w:r>
-      <w:proofErr w:type="spellEnd"/>
-      <w:r>
-        <w:rPr>
-          <w:rFonts w:ascii="Courier New" w:eastAsia="Courier New" w:hAnsi="Courier New" w:cs="Courier New"/>
-          <w:sz w:val="20"/>
-          <w:szCs w:val="20"/>
-        </w:rPr>
-        <w:t xml:space="preserve"> = 0 </w:t>
-      </w:r>
-      <w:proofErr w:type="spellStart"/>
-      <w:r>
-        <w:rPr>
-          <w:rFonts w:ascii="Courier New" w:eastAsia="Courier New" w:hAnsi="Courier New" w:cs="Courier New"/>
-          <w:sz w:val="20"/>
-          <w:szCs w:val="20"/>
-        </w:rPr>
-        <w:t>then</w:t>
-      </w:r>
-      <w:proofErr w:type="spellEnd"/>
-    </w:p>
-    <w:p>
-      <w:pPr>
-        <w:spacing w:after="120" w:line="240" w:lineRule="auto"/>
-        <w:rPr>
-          <w:rFonts w:ascii="Courier New" w:eastAsia="Courier New" w:hAnsi="Courier New" w:cs="Courier New"/>
-          <w:sz w:val="20"/>
-          <w:szCs w:val="20"/>
-        </w:rPr>
-      </w:pPr>
-      <w:r>
-        <w:rPr>
-          <w:rFonts w:ascii="Courier New" w:eastAsia="Courier New" w:hAnsi="Courier New" w:cs="Courier New"/>
-          <w:sz w:val="20"/>
-          <w:szCs w:val="20"/>
-        </w:rPr>
-        <w:t xml:space="preserve">                    -- loop </w:t>
-      </w:r>
-      <w:proofErr w:type="spellStart"/>
-      <w:r>
-        <w:rPr>
-          <w:rFonts w:ascii="Courier New" w:eastAsia="Courier New" w:hAnsi="Courier New" w:cs="Courier New"/>
-          <w:sz w:val="20"/>
-          <w:szCs w:val="20"/>
-        </w:rPr>
-        <w:t>if</w:t>
-      </w:r>
-      <w:proofErr w:type="spellEnd"/>
-      <w:r>
-        <w:rPr>
-          <w:rFonts w:ascii="Courier New" w:eastAsia="Courier New" w:hAnsi="Courier New" w:cs="Courier New"/>
-          <w:sz w:val="20"/>
-          <w:szCs w:val="20"/>
-        </w:rPr>
-        <w:t xml:space="preserve"> data </w:t>
-      </w:r>
-      <w:proofErr w:type="spellStart"/>
-      <w:r>
-        <w:rPr>
-          <w:rFonts w:ascii="Courier New" w:eastAsia="Courier New" w:hAnsi="Courier New" w:cs="Courier New"/>
-          <w:sz w:val="20"/>
-          <w:szCs w:val="20"/>
-        </w:rPr>
-        <w:t>finished</w:t>
-      </w:r>
-      <w:proofErr w:type="spellEnd"/>
-      <w:r>
-        <w:rPr>
-          <w:rFonts w:ascii="Courier New" w:eastAsia="Courier New" w:hAnsi="Courier New" w:cs="Courier New"/>
-          <w:sz w:val="20"/>
-          <w:szCs w:val="20"/>
-        </w:rPr>
-        <w:t xml:space="preserve"> </w:t>
-      </w:r>
-      <w:proofErr w:type="spellStart"/>
-      <w:r>
-        <w:rPr>
-          <w:rFonts w:ascii="Courier New" w:eastAsia="Courier New" w:hAnsi="Courier New" w:cs="Courier New"/>
-          <w:sz w:val="20"/>
-          <w:szCs w:val="20"/>
-        </w:rPr>
-        <w:t>being</w:t>
-      </w:r>
-      <w:proofErr w:type="spellEnd"/>
-      <w:r>
-        <w:rPr>
-          <w:rFonts w:ascii="Courier New" w:eastAsia="Courier New" w:hAnsi="Courier New" w:cs="Courier New"/>
-          <w:sz w:val="20"/>
-          <w:szCs w:val="20"/>
-        </w:rPr>
-        <w:t xml:space="preserve"> </w:t>
-      </w:r>
-      <w:proofErr w:type="spellStart"/>
-      <w:r>
-        <w:rPr>
-          <w:rFonts w:ascii="Courier New" w:eastAsia="Courier New" w:hAnsi="Courier New" w:cs="Courier New"/>
-          <w:sz w:val="20"/>
-          <w:szCs w:val="20"/>
-        </w:rPr>
-        <w:t>read</w:t>
-      </w:r>
-      <w:proofErr w:type="spellEnd"/>
-    </w:p>
-    <w:p>
-      <w:pPr>
-        <w:spacing w:after="120" w:line="240" w:lineRule="auto"/>
-        <w:rPr>
-          <w:rFonts w:ascii="Courier New" w:eastAsia="Courier New" w:hAnsi="Courier New" w:cs="Courier New"/>
-          <w:sz w:val="20"/>
-          <w:szCs w:val="20"/>
-        </w:rPr>
-      </w:pPr>
-      <w:r>
-        <w:rPr>
-          <w:rFonts w:ascii="Courier New" w:eastAsia="Courier New" w:hAnsi="Courier New" w:cs="Courier New"/>
-          <w:sz w:val="20"/>
-          <w:szCs w:val="20"/>
-        </w:rPr>
-        <w:t xml:space="preserve">                    </w:t>
-      </w:r>
-      <w:proofErr w:type="spellStart"/>
-      <w:r>
-        <w:rPr>
-          <w:rFonts w:ascii="Courier New" w:eastAsia="Courier New" w:hAnsi="Courier New" w:cs="Courier New"/>
-          <w:sz w:val="20"/>
-          <w:szCs w:val="20"/>
-        </w:rPr>
-        <w:t>bit_ptr</w:t>
-      </w:r>
-      <w:proofErr w:type="spellEnd"/>
-      <w:r>
-        <w:rPr>
-          <w:rFonts w:ascii="Courier New" w:eastAsia="Courier New" w:hAnsi="Courier New" w:cs="Courier New"/>
-          <w:sz w:val="20"/>
-          <w:szCs w:val="20"/>
-        </w:rPr>
-        <w:t xml:space="preserve"> &lt;= DATA_WIDTH - 1;</w:t>
-      </w:r>
-    </w:p>
-    <w:p>
-      <w:pPr>
-        <w:spacing w:after="120" w:line="240" w:lineRule="auto"/>
-        <w:rPr>
-          <w:rFonts w:ascii="Courier New" w:eastAsia="Courier New" w:hAnsi="Courier New" w:cs="Courier New"/>
-          <w:sz w:val="20"/>
-          <w:szCs w:val="20"/>
-        </w:rPr>
-      </w:pPr>
-      <w:r>
-        <w:rPr>
-          <w:rFonts w:ascii="Courier New" w:eastAsia="Courier New" w:hAnsi="Courier New" w:cs="Courier New"/>
-          <w:sz w:val="20"/>
-          <w:szCs w:val="20"/>
-        </w:rPr>
-        <w:t xml:space="preserve">                </w:t>
-      </w:r>
-      <w:proofErr w:type="spellStart"/>
-      <w:r>
-        <w:rPr>
-          <w:rFonts w:ascii="Courier New" w:eastAsia="Courier New" w:hAnsi="Courier New" w:cs="Courier New"/>
-          <w:sz w:val="20"/>
-          <w:szCs w:val="20"/>
-        </w:rPr>
-        <w:t>else</w:t>
-      </w:r>
-      <w:proofErr w:type="spellEnd"/>
-    </w:p>
-    <w:p>
-      <w:pPr>
-        <w:spacing w:after="120" w:line="240" w:lineRule="auto"/>
-        <w:rPr>
-          <w:rFonts w:ascii="Courier New" w:eastAsia="Courier New" w:hAnsi="Courier New" w:cs="Courier New"/>
-          <w:sz w:val="20"/>
-          <w:szCs w:val="20"/>
-        </w:rPr>
-      </w:pPr>
-      <w:r>
-        <w:rPr>
-          <w:rFonts w:ascii="Courier New" w:eastAsia="Courier New" w:hAnsi="Courier New" w:cs="Courier New"/>
-          <w:sz w:val="20"/>
-          <w:szCs w:val="20"/>
-        </w:rPr>
-        <w:t xml:space="preserve">                    -- move </w:t>
-      </w:r>
-      <w:proofErr w:type="spellStart"/>
-      <w:r>
-        <w:rPr>
-          <w:rFonts w:ascii="Courier New" w:eastAsia="Courier New" w:hAnsi="Courier New" w:cs="Courier New"/>
-          <w:sz w:val="20"/>
-          <w:szCs w:val="20"/>
-        </w:rPr>
-        <w:t>on</w:t>
-      </w:r>
-      <w:proofErr w:type="spellEnd"/>
-      <w:r>
-        <w:rPr>
-          <w:rFonts w:ascii="Courier New" w:eastAsia="Courier New" w:hAnsi="Courier New" w:cs="Courier New"/>
-          <w:sz w:val="20"/>
-          <w:szCs w:val="20"/>
-        </w:rPr>
-        <w:t xml:space="preserve"> </w:t>
-      </w:r>
-      <w:proofErr w:type="spellStart"/>
-      <w:r>
-        <w:rPr>
-          <w:rFonts w:ascii="Courier New" w:eastAsia="Courier New" w:hAnsi="Courier New" w:cs="Courier New"/>
-          <w:sz w:val="20"/>
-          <w:szCs w:val="20"/>
-        </w:rPr>
-        <w:t>to</w:t>
-      </w:r>
-      <w:proofErr w:type="spellEnd"/>
-      <w:r>
-        <w:rPr>
-          <w:rFonts w:ascii="Courier New" w:eastAsia="Courier New" w:hAnsi="Courier New" w:cs="Courier New"/>
-          <w:sz w:val="20"/>
-          <w:szCs w:val="20"/>
-        </w:rPr>
-        <w:t xml:space="preserve"> </w:t>
-      </w:r>
-      <w:proofErr w:type="spellStart"/>
-      <w:r>
-        <w:rPr>
-          <w:rFonts w:ascii="Courier New" w:eastAsia="Courier New" w:hAnsi="Courier New" w:cs="Courier New"/>
-          <w:sz w:val="20"/>
-          <w:szCs w:val="20"/>
-        </w:rPr>
-        <w:t>the</w:t>
-      </w:r>
-      <w:proofErr w:type="spellEnd"/>
-      <w:r>
-        <w:rPr>
-          <w:rFonts w:ascii="Courier New" w:eastAsia="Courier New" w:hAnsi="Courier New" w:cs="Courier New"/>
-          <w:sz w:val="20"/>
-          <w:szCs w:val="20"/>
-        </w:rPr>
-        <w:t xml:space="preserve"> </w:t>
-      </w:r>
-      <w:proofErr w:type="spellStart"/>
-      <w:r>
-        <w:rPr>
-          <w:rFonts w:ascii="Courier New" w:eastAsia="Courier New" w:hAnsi="Courier New" w:cs="Courier New"/>
-          <w:sz w:val="20"/>
-          <w:szCs w:val="20"/>
-        </w:rPr>
-        <w:t>next</w:t>
-      </w:r>
-      <w:proofErr w:type="spellEnd"/>
-      <w:r>
-        <w:rPr>
-          <w:rFonts w:ascii="Courier New" w:eastAsia="Courier New" w:hAnsi="Courier New" w:cs="Courier New"/>
-          <w:sz w:val="20"/>
-          <w:szCs w:val="20"/>
-        </w:rPr>
-        <w:t xml:space="preserve"> bit </w:t>
-      </w:r>
-      <w:proofErr w:type="spellStart"/>
-      <w:r>
-        <w:rPr>
-          <w:rFonts w:ascii="Courier New" w:eastAsia="Courier New" w:hAnsi="Courier New" w:cs="Courier New"/>
-          <w:sz w:val="20"/>
-          <w:szCs w:val="20"/>
-        </w:rPr>
-        <w:t>down</w:t>
-      </w:r>
-      <w:proofErr w:type="spellEnd"/>
-    </w:p>
-    <w:p>
-      <w:pPr>
-        <w:spacing w:after="120" w:line="240" w:lineRule="auto"/>
-        <w:rPr>
-          <w:rFonts w:ascii="Courier New" w:eastAsia="Courier New" w:hAnsi="Courier New" w:cs="Courier New"/>
-          <w:sz w:val="20"/>
-          <w:szCs w:val="20"/>
-        </w:rPr>
-      </w:pPr>
-      <w:r>
-        <w:rPr>
-          <w:rFonts w:ascii="Courier New" w:eastAsia="Courier New" w:hAnsi="Courier New" w:cs="Courier New"/>
-          <w:sz w:val="20"/>
-          <w:szCs w:val="20"/>
-        </w:rPr>
-        <w:t xml:space="preserve">                    </w:t>
-      </w:r>
-      <w:proofErr w:type="spellStart"/>
-      <w:r>
-        <w:rPr>
-          <w:rFonts w:ascii="Courier New" w:eastAsia="Courier New" w:hAnsi="Courier New" w:cs="Courier New"/>
-          <w:sz w:val="20"/>
-          <w:szCs w:val="20"/>
-        </w:rPr>
-        <w:t>bit_ptr</w:t>
-      </w:r>
-      <w:proofErr w:type="spellEnd"/>
-      <w:r>
-        <w:rPr>
-          <w:rFonts w:ascii="Courier New" w:eastAsia="Courier New" w:hAnsi="Courier New" w:cs="Courier New"/>
-          <w:sz w:val="20"/>
-          <w:szCs w:val="20"/>
-        </w:rPr>
-        <w:t xml:space="preserve"> &lt;= </w:t>
-      </w:r>
-      <w:proofErr w:type="spellStart"/>
-      <w:r>
-        <w:rPr>
-          <w:rFonts w:ascii="Courier New" w:eastAsia="Courier New" w:hAnsi="Courier New" w:cs="Courier New"/>
-          <w:sz w:val="20"/>
-          <w:szCs w:val="20"/>
-        </w:rPr>
-        <w:t>bit_ptr</w:t>
-      </w:r>
-      <w:proofErr w:type="spellEnd"/>
-      <w:r>
-        <w:rPr>
-          <w:rFonts w:ascii="Courier New" w:eastAsia="Courier New" w:hAnsi="Courier New" w:cs="Courier New"/>
-          <w:sz w:val="20"/>
-          <w:szCs w:val="20"/>
-        </w:rPr>
-        <w:t xml:space="preserve"> - 1;</w:t>
-      </w:r>
-    </w:p>
-    <w:p>
-      <w:pPr>
-        <w:spacing w:after="120" w:line="240" w:lineRule="auto"/>
-        <w:rPr>
-          <w:rFonts w:ascii="Courier New" w:eastAsia="Courier New" w:hAnsi="Courier New" w:cs="Courier New"/>
-          <w:sz w:val="20"/>
-          <w:szCs w:val="20"/>
-        </w:rPr>
-      </w:pPr>
-      <w:r>
-        <w:rPr>
-          <w:rFonts w:ascii="Courier New" w:eastAsia="Courier New" w:hAnsi="Courier New" w:cs="Courier New"/>
-          <w:sz w:val="20"/>
-          <w:szCs w:val="20"/>
-        </w:rPr>
         <w:t xml:space="preserve">                </w:t>
       </w:r>
       <w:proofErr w:type="spellStart"/>
@@ -20461,7 +20502,6 @@
           <w:b/>
           <w:bCs/>
         </w:rPr>
-        <w:lastRenderedPageBreak/>
         <w:t>bit_ptr</w:t>
       </w:r>
       <w:proofErr w:type="spellEnd"/>
@@ -22105,6 +22145,7 @@
           <w:sz w:val="20"/>
           <w:szCs w:val="20"/>
         </w:rPr>
+        <w:lastRenderedPageBreak/>
         <w:t xml:space="preserve">        </w:t>
       </w:r>
       <w:proofErr w:type="spellStart"/>
@@ -22339,7 +22380,6 @@
           <w:sz w:val="20"/>
           <w:szCs w:val="20"/>
         </w:rPr>
-        <w:lastRenderedPageBreak/>
         <w:t xml:space="preserve">            </w:t>
       </w:r>
       <w:proofErr w:type="spellStart"/>
@@ -25909,7 +25949,6 @@
   <w:style w:type="character" w:default="1" w:styleId="Fontepargpadro">
     <w:name w:val="Default Paragraph Font"/>
     <w:uiPriority w:val="1"/>
-    <w:semiHidden/>
     <w:unhideWhenUsed/>
   </w:style>
   <w:style w:type="table" w:default="1" w:styleId="Tabelanormal">
@@ -26276,6 +26315,49 @@
       <w:u w:val="single"/>
     </w:rPr>
   </w:style>
+  <w:style w:type="paragraph" w:customStyle="1" w:styleId="Estilo5">
+    <w:name w:val="Estilo5"/>
+    <w:basedOn w:val="Normal"/>
+    <w:link w:val="Estilo5Char"/>
+    <w:qFormat/>
+    <w:rsid w:val="00A7561B"/>
+    <w:pPr>
+      <w:pBdr>
+        <w:top w:val="nil"/>
+        <w:left w:val="nil"/>
+        <w:bottom w:val="nil"/>
+        <w:right w:val="nil"/>
+        <w:between w:val="nil"/>
+      </w:pBdr>
+      <w:ind w:firstLine="576"/>
+    </w:pPr>
+    <w:rPr>
+      <w:rFonts w:ascii="Arial" w:eastAsia="Arial" w:hAnsi="Arial" w:cs="Arial"/>
+      <w:color w:val="000000"/>
+    </w:rPr>
+  </w:style>
+  <w:style w:type="character" w:customStyle="1" w:styleId="Estilo5Char">
+    <w:name w:val="Estilo5 Char"/>
+    <w:basedOn w:val="Fontepargpadro"/>
+    <w:link w:val="Estilo5"/>
+    <w:rsid w:val="00A7561B"/>
+    <w:rPr>
+      <w:rFonts w:ascii="Arial" w:eastAsia="Arial" w:hAnsi="Arial" w:cs="Arial"/>
+      <w:color w:val="000000"/>
+    </w:rPr>
+  </w:style>
+  <w:style w:type="paragraph" w:styleId="NormalWeb">
+    <w:name w:val="Normal (Web)"/>
+    <w:basedOn w:val="Normal"/>
+    <w:uiPriority w:val="99"/>
+    <w:semiHidden/>
+    <w:unhideWhenUsed/>
+    <w:rsid w:val="000439CE"/>
+    <w:pPr>
+      <w:spacing w:before="100" w:beforeAutospacing="1" w:after="100" w:afterAutospacing="1" w:line="240" w:lineRule="auto"/>
+      <w:jc w:val="left"/>
+    </w:pPr>
+  </w:style>
 </w:styles>
 </file>
 

</xml_diff>